<commit_message>
Se sube archivo correspondiente.
</commit_message>
<xml_diff>
--- a/Fase 2/Evidencia Individuales/MARGARITA_SILVA_2.1_APT122_DiarioReflexionFase2 .docx
+++ b/Fase 2/Evidencia Individuales/MARGARITA_SILVA_2.1_APT122_DiarioReflexionFase2 .docx
@@ -1,6 +1,6 @@
 
 <file path=word/document.xml><?xml version="1.0" encoding="utf-8"?>
-<w:document xmlns:wpc="http://schemas.microsoft.com/office/word/2010/wordprocessingCanvas" xmlns:cx="http://schemas.microsoft.com/office/drawing/2014/chartex" xmlns:cx1="http://schemas.microsoft.com/office/drawing/2015/9/8/chartex" xmlns:cx2="http://schemas.microsoft.com/office/drawing/2015/10/21/chartex" xmlns:cx3="http://schemas.microsoft.com/office/drawing/2016/5/9/chartex" xmlns:cx4="http://schemas.microsoft.com/office/drawing/2016/5/10/chartex" xmlns:cx5="http://schemas.microsoft.com/office/drawing/2016/5/11/chartex" xmlns:cx6="http://schemas.microsoft.com/office/drawing/2016/5/12/chartex" xmlns:cx7="http://schemas.microsoft.com/office/drawing/2016/5/13/chartex" xmlns:cx8="http://schemas.microsoft.com/office/drawing/2016/5/14/chartex" xmlns:mc="http://schemas.openxmlformats.org/markup-compatibility/2006" xmlns:aink="http://schemas.microsoft.com/office/drawing/2016/ink" xmlns:am3d="http://schemas.microsoft.com/office/drawing/2017/model3d" xmlns:o="urn:schemas-microsoft-com:office:office" xmlns:oel="http://schemas.microsoft.com/office/2019/extlst" xmlns:r="http://schemas.openxmlformats.org/officeDocument/2006/relationships" xmlns:m="http://schemas.openxmlformats.org/officeDocument/2006/math" xmlns:v="urn:schemas-microsoft-com:vml" xmlns:wp14="http://schemas.microsoft.com/office/word/2010/wordprocessingDrawing" xmlns:wp="http://schemas.openxmlformats.org/drawingml/2006/wordprocessingDrawing" xmlns:w10="urn:schemas-microsoft-com:office:word" xmlns:w="http://schemas.openxmlformats.org/wordprocessingml/2006/main" xmlns:w14="http://schemas.microsoft.com/office/word/2010/wordml" xmlns:w15="http://schemas.microsoft.com/office/word/2012/wordml" xmlns:w16cex="http://schemas.microsoft.com/office/word/2018/wordml/cex" xmlns:w16cid="http://schemas.microsoft.com/office/word/2016/wordml/cid" xmlns:w16="http://schemas.microsoft.com/office/word/2018/wordml" xmlns:w16du="http://schemas.microsoft.com/office/word/2023/wordml/word16du" xmlns:w16sdtdh="http://schemas.microsoft.com/office/word/2020/wordml/sdtdatahash" xmlns:w16sdtfl="http://schemas.microsoft.com/office/word/2024/wordml/sdtformatlock" xmlns:w16se="http://schemas.microsoft.com/office/word/2015/wordml/symex" xmlns:wpg="http://schemas.microsoft.com/office/word/2010/wordprocessingGroup" xmlns:wpi="http://schemas.microsoft.com/office/word/2010/wordprocessingInk" xmlns:wne="http://schemas.microsoft.com/office/word/2006/wordml" xmlns:wps="http://schemas.microsoft.com/office/word/2010/wordprocessingShape" mc:Ignorable="w14 w15 w16se w16cid w16 w16cex w16sdtdh w16sdtfl w16du wp14">
+<w:document xmlns:wpc="http://schemas.microsoft.com/office/word/2010/wordprocessingCanvas" xmlns:cx="http://schemas.microsoft.com/office/drawing/2014/chartex" xmlns:mc="http://schemas.openxmlformats.org/markup-compatibility/2006" xmlns:o="urn:schemas-microsoft-com:office:office" xmlns:r="http://schemas.openxmlformats.org/officeDocument/2006/relationships" xmlns:m="http://schemas.openxmlformats.org/officeDocument/2006/math" xmlns:v="urn:schemas-microsoft-com:vml" xmlns:wp14="http://schemas.microsoft.com/office/word/2010/wordprocessingDrawing" xmlns:wp="http://schemas.openxmlformats.org/drawingml/2006/wordprocessingDrawing" xmlns:w10="urn:schemas-microsoft-com:office:word" xmlns:w="http://schemas.openxmlformats.org/wordprocessingml/2006/main" xmlns:w14="http://schemas.microsoft.com/office/word/2010/wordml" xmlns:w15="http://schemas.microsoft.com/office/word/2012/wordml" xmlns:w16se="http://schemas.microsoft.com/office/word/2015/wordml/symex" xmlns:wpg="http://schemas.microsoft.com/office/word/2010/wordprocessingGroup" xmlns:wpi="http://schemas.microsoft.com/office/word/2010/wordprocessingInk" xmlns:wne="http://schemas.microsoft.com/office/word/2006/wordml" xmlns:wps="http://schemas.microsoft.com/office/word/2010/wordprocessingShape" mc:Ignorable="w14 w15 w16se wp14">
   <w:body>
     <w:p/>
     <w:tbl>
@@ -48,7 +48,7 @@
                 <w:color w:val="1D2763"/>
                 <w:sz w:val="28"/>
                 <w:szCs w:val="28"/>
-                <w:lang w:eastAsia="es-CL"/>
+                <w:lang w:val="en-US"/>
               </w:rPr>
               <w:drawing>
                 <wp:inline distT="0" distB="0" distL="0" distR="0" wp14:anchorId="5010E2A1" wp14:editId="32D31CB8">
@@ -279,7 +279,6 @@
             <w:pPr>
               <w:rPr>
                 <w:rFonts w:eastAsiaTheme="majorEastAsia"/>
-                <w:b/>
                 <w:bCs/>
                 <w:color w:val="767171" w:themeColor="background2" w:themeShade="80"/>
                 <w:sz w:val="24"/>
@@ -292,25 +291,7 @@
                 <w:sz w:val="24"/>
                 <w:szCs w:val="24"/>
               </w:rPr>
-              <w:t xml:space="preserve">1. Mira </w:t>
-            </w:r>
-            <w:proofErr w:type="spellStart"/>
-            <w:r>
-              <w:rPr>
-                <w:rFonts w:eastAsiaTheme="majorEastAsia"/>
-                <w:sz w:val="24"/>
-                <w:szCs w:val="24"/>
-              </w:rPr>
-              <w:t>tu</w:t>
-            </w:r>
-            <w:proofErr w:type="spellEnd"/>
-            <w:r>
-              <w:rPr>
-                <w:rFonts w:eastAsiaTheme="majorEastAsia"/>
-                <w:sz w:val="24"/>
-                <w:szCs w:val="24"/>
-              </w:rPr>
-              <w:t xml:space="preserve"> carta Gantt y reflexiona sobre los avances de tu Proyecto APT</w:t>
+              <w:t>1. Mira tu carta Gantt y reflexiona sobre los avances de tu Proyecto APT</w:t>
             </w:r>
           </w:p>
         </w:tc>
@@ -358,12 +339,218 @@
             <w:pPr>
               <w:jc w:val="both"/>
               <w:rPr>
-                <w:rFonts w:ascii="Calibri" w:hAnsi="Calibri"/>
+                <w:rFonts w:asciiTheme="majorHAnsi" w:eastAsiaTheme="majorEastAsia" w:hAnsiTheme="majorHAnsi" w:cstheme="majorHAnsi"/>
+                <w:b/>
+                <w:color w:val="1F4E79" w:themeColor="accent1" w:themeShade="80"/>
+                <w:sz w:val="24"/>
+                <w:szCs w:val="24"/>
+              </w:rPr>
+            </w:pPr>
+            <w:r>
+              <w:rPr>
+                <w:rFonts w:asciiTheme="majorHAnsi" w:eastAsiaTheme="majorEastAsia" w:hAnsiTheme="majorHAnsi" w:cstheme="majorHAnsi"/>
+                <w:b/>
+                <w:color w:val="1F4E79" w:themeColor="accent1" w:themeShade="80"/>
+                <w:sz w:val="24"/>
+                <w:szCs w:val="24"/>
+              </w:rPr>
+              <w:t>En general</w:t>
+            </w:r>
+            <w:r>
+              <w:rPr>
+                <w:rFonts w:asciiTheme="majorHAnsi" w:eastAsiaTheme="majorEastAsia" w:hAnsiTheme="majorHAnsi" w:cstheme="majorHAnsi"/>
+                <w:b/>
+                <w:color w:val="1F4E79" w:themeColor="accent1" w:themeShade="80"/>
+                <w:sz w:val="24"/>
+                <w:szCs w:val="24"/>
+              </w:rPr>
+              <w:t xml:space="preserve">, he podido cumplir con la mayoría de las actividades dentro de los tiempos </w:t>
+            </w:r>
+            <w:r>
+              <w:rPr>
+                <w:rFonts w:asciiTheme="majorHAnsi" w:eastAsiaTheme="majorEastAsia" w:hAnsiTheme="majorHAnsi" w:cstheme="majorHAnsi"/>
+                <w:b/>
+                <w:color w:val="1F4E79" w:themeColor="accent1" w:themeShade="80"/>
+                <w:sz w:val="24"/>
+                <w:szCs w:val="24"/>
+              </w:rPr>
+              <w:t>establecidos en la carta Gantt.</w:t>
+            </w:r>
+          </w:p>
+          <w:p>
+            <w:pPr>
+              <w:jc w:val="both"/>
+              <w:rPr>
+                <w:rFonts w:asciiTheme="majorHAnsi" w:eastAsiaTheme="majorEastAsia" w:hAnsiTheme="majorHAnsi" w:cstheme="majorHAnsi"/>
+                <w:b/>
+                <w:color w:val="1F4E79" w:themeColor="accent1" w:themeShade="80"/>
+                <w:sz w:val="24"/>
+                <w:szCs w:val="24"/>
+              </w:rPr>
+            </w:pPr>
+            <w:r>
+              <w:rPr>
+                <w:rFonts w:asciiTheme="majorHAnsi" w:eastAsiaTheme="majorEastAsia" w:hAnsiTheme="majorHAnsi" w:cstheme="majorHAnsi"/>
+                <w:b/>
+                <w:color w:val="1F4E79" w:themeColor="accent1" w:themeShade="80"/>
+                <w:sz w:val="24"/>
+                <w:szCs w:val="24"/>
+              </w:rPr>
+              <w:t>L</w:t>
+            </w:r>
+            <w:r>
+              <w:rPr>
+                <w:rFonts w:asciiTheme="majorHAnsi" w:eastAsiaTheme="majorEastAsia" w:hAnsiTheme="majorHAnsi" w:cstheme="majorHAnsi"/>
+                <w:b/>
+                <w:color w:val="1F4E79" w:themeColor="accent1" w:themeShade="80"/>
+                <w:sz w:val="24"/>
+                <w:szCs w:val="24"/>
+              </w:rPr>
+              <w:t>as primeras etapas fue el análisis de problema</w:t>
+            </w:r>
+            <w:r>
+              <w:rPr>
+                <w:rFonts w:asciiTheme="majorHAnsi" w:eastAsiaTheme="majorEastAsia" w:hAnsiTheme="majorHAnsi" w:cstheme="majorHAnsi"/>
+                <w:b/>
+                <w:color w:val="1F4E79" w:themeColor="accent1" w:themeShade="80"/>
+                <w:sz w:val="24"/>
+                <w:szCs w:val="24"/>
+              </w:rPr>
+              <w:t xml:space="preserve">, levantamientos de </w:t>
+            </w:r>
+            <w:r>
+              <w:rPr>
+                <w:rFonts w:asciiTheme="majorHAnsi" w:eastAsiaTheme="majorEastAsia" w:hAnsiTheme="majorHAnsi" w:cstheme="majorHAnsi"/>
+                <w:b/>
+                <w:color w:val="1F4E79" w:themeColor="accent1" w:themeShade="80"/>
+                <w:sz w:val="24"/>
+                <w:szCs w:val="24"/>
+              </w:rPr>
+              <w:t>requerimientos</w:t>
+            </w:r>
+            <w:r>
+              <w:rPr>
+                <w:rFonts w:asciiTheme="majorHAnsi" w:eastAsiaTheme="majorEastAsia" w:hAnsiTheme="majorHAnsi" w:cstheme="majorHAnsi"/>
+                <w:b/>
+                <w:color w:val="1F4E79" w:themeColor="accent1" w:themeShade="80"/>
+                <w:sz w:val="24"/>
+                <w:szCs w:val="24"/>
+              </w:rPr>
+              <w:t>, modelado</w:t>
+            </w:r>
+            <w:r>
+              <w:rPr>
+                <w:rFonts w:asciiTheme="majorHAnsi" w:eastAsiaTheme="majorEastAsia" w:hAnsiTheme="majorHAnsi" w:cstheme="majorHAnsi"/>
+                <w:b/>
+                <w:color w:val="1F4E79" w:themeColor="accent1" w:themeShade="80"/>
+                <w:sz w:val="24"/>
+                <w:szCs w:val="24"/>
+              </w:rPr>
+              <w:t xml:space="preserve"> del proceso</w:t>
+            </w:r>
+            <w:r>
+              <w:rPr>
+                <w:rFonts w:asciiTheme="majorHAnsi" w:eastAsiaTheme="majorEastAsia" w:hAnsiTheme="majorHAnsi" w:cstheme="majorHAnsi"/>
+                <w:b/>
+                <w:color w:val="1F4E79" w:themeColor="accent1" w:themeShade="80"/>
+                <w:sz w:val="24"/>
+                <w:szCs w:val="24"/>
+              </w:rPr>
+              <w:t>, definición de arquitectura y el desarrollo de los primeros módulos.</w:t>
+            </w:r>
+          </w:p>
+          <w:p>
+            <w:pPr>
+              <w:jc w:val="both"/>
+              <w:rPr>
+                <w:rFonts w:asciiTheme="majorHAnsi" w:eastAsiaTheme="majorEastAsia" w:hAnsiTheme="majorHAnsi" w:cstheme="majorHAnsi"/>
+                <w:b/>
+                <w:color w:val="1F4E79" w:themeColor="accent1" w:themeShade="80"/>
+                <w:sz w:val="24"/>
+                <w:szCs w:val="24"/>
+              </w:rPr>
+            </w:pPr>
+            <w:r>
+              <w:rPr>
+                <w:rFonts w:asciiTheme="majorHAnsi" w:eastAsiaTheme="majorEastAsia" w:hAnsiTheme="majorHAnsi" w:cstheme="majorHAnsi"/>
+                <w:b/>
+                <w:color w:val="1F4E79" w:themeColor="accent1" w:themeShade="80"/>
+                <w:sz w:val="24"/>
+                <w:szCs w:val="24"/>
+              </w:rPr>
+              <w:t>Los factores que h</w:t>
+            </w:r>
+            <w:r>
+              <w:rPr>
+                <w:rFonts w:asciiTheme="majorHAnsi" w:eastAsiaTheme="majorEastAsia" w:hAnsiTheme="majorHAnsi" w:cstheme="majorHAnsi"/>
+                <w:b/>
+                <w:color w:val="1F4E79" w:themeColor="accent1" w:themeShade="80"/>
+                <w:sz w:val="24"/>
+                <w:szCs w:val="24"/>
+              </w:rPr>
+              <w:t xml:space="preserve">emos </w:t>
+            </w:r>
+            <w:r>
+              <w:rPr>
+                <w:rFonts w:asciiTheme="majorHAnsi" w:eastAsiaTheme="majorEastAsia" w:hAnsiTheme="majorHAnsi" w:cstheme="majorHAnsi"/>
+                <w:b/>
+                <w:color w:val="1F4E79" w:themeColor="accent1" w:themeShade="80"/>
+                <w:sz w:val="24"/>
+                <w:szCs w:val="24"/>
+              </w:rPr>
+              <w:t>facilitamos en el avance</w:t>
+            </w:r>
+            <w:r>
+              <w:rPr>
+                <w:rFonts w:asciiTheme="majorHAnsi" w:eastAsiaTheme="majorEastAsia" w:hAnsiTheme="majorHAnsi" w:cstheme="majorHAnsi"/>
+                <w:b/>
+                <w:color w:val="1F4E79" w:themeColor="accent1" w:themeShade="80"/>
+                <w:sz w:val="24"/>
+                <w:szCs w:val="24"/>
+              </w:rPr>
+              <w:t xml:space="preserve"> es tener una planificación clara y detallada en la carta Gantt. La división de tareas que nos permitió avanzar en el modelamiento, arquitectura y desarrollo.</w:t>
+            </w:r>
+          </w:p>
+          <w:p>
+            <w:pPr>
+              <w:jc w:val="both"/>
+              <w:rPr>
+                <w:rFonts w:asciiTheme="majorHAnsi" w:hAnsiTheme="majorHAnsi" w:cstheme="majorHAnsi"/>
                 <w:b/>
                 <w:bCs/>
                 <w:color w:val="1F4E79" w:themeColor="accent1" w:themeShade="80"/>
               </w:rPr>
             </w:pPr>
+            <w:r>
+              <w:rPr>
+                <w:rFonts w:asciiTheme="majorHAnsi" w:eastAsiaTheme="majorEastAsia" w:hAnsiTheme="majorHAnsi" w:cstheme="majorHAnsi"/>
+                <w:b/>
+                <w:color w:val="1F4E79" w:themeColor="accent1" w:themeShade="80"/>
+                <w:sz w:val="24"/>
+                <w:szCs w:val="24"/>
+              </w:rPr>
+              <w:t>Aun así, hemos enfrentado algunas dificultades durante el desarrollo como las responsabilidades laborales por el tiemp</w:t>
+            </w:r>
+            <w:r>
+              <w:rPr>
+                <w:rFonts w:asciiTheme="majorHAnsi" w:eastAsiaTheme="majorEastAsia" w:hAnsiTheme="majorHAnsi" w:cstheme="majorHAnsi"/>
+                <w:b/>
+                <w:color w:val="1F4E79" w:themeColor="accent1" w:themeShade="80"/>
+                <w:sz w:val="24"/>
+                <w:szCs w:val="24"/>
+              </w:rPr>
+              <w:t xml:space="preserve">o que nos ocupa trabajando donde podemos estar priorizando nuestro </w:t>
+            </w:r>
+            <w:r>
+              <w:rPr>
+                <w:rFonts w:asciiTheme="majorHAnsi" w:eastAsiaTheme="majorEastAsia" w:hAnsiTheme="majorHAnsi" w:cstheme="majorHAnsi"/>
+                <w:b/>
+                <w:color w:val="1F4E79" w:themeColor="accent1" w:themeShade="80"/>
+                <w:sz w:val="24"/>
+                <w:szCs w:val="24"/>
+              </w:rPr>
+              <w:t>proyecto, pero aun logramos cumplir nuestros trabajos.</w:t>
+            </w:r>
           </w:p>
           <w:p>
             <w:pPr>
@@ -482,6 +669,118 @@
             <w:pPr>
               <w:jc w:val="both"/>
               <w:rPr>
+                <w:rFonts w:cstheme="minorHAnsi"/>
+                <w:b/>
+                <w:bCs/>
+                <w:color w:val="1F4E79" w:themeColor="accent1" w:themeShade="80"/>
+                <w:sz w:val="24"/>
+                <w:szCs w:val="24"/>
+              </w:rPr>
+            </w:pPr>
+            <w:r>
+              <w:rPr>
+                <w:rFonts w:cstheme="minorHAnsi"/>
+                <w:b/>
+                <w:bCs/>
+                <w:color w:val="1F4E79" w:themeColor="accent1" w:themeShade="80"/>
+                <w:sz w:val="24"/>
+                <w:szCs w:val="24"/>
+              </w:rPr>
+              <w:t xml:space="preserve">Para enfrentar las dificultades he tenido que reorganizar tareas y priorizar actividades críticas. </w:t>
+            </w:r>
+            <w:r>
+              <w:rPr>
+                <w:rFonts w:cstheme="minorHAnsi"/>
+                <w:b/>
+                <w:bCs/>
+                <w:color w:val="1F4E79" w:themeColor="accent1" w:themeShade="80"/>
+                <w:sz w:val="24"/>
+                <w:szCs w:val="24"/>
+              </w:rPr>
+              <w:t>En relación a mis limitaciones de tiempo por responsabilidades laborales, he tratado de organizar mejor mis horarios para pod</w:t>
+            </w:r>
+            <w:r>
+              <w:rPr>
+                <w:rFonts w:cstheme="minorHAnsi"/>
+                <w:b/>
+                <w:bCs/>
+                <w:color w:val="1F4E79" w:themeColor="accent1" w:themeShade="80"/>
+                <w:sz w:val="24"/>
+                <w:szCs w:val="24"/>
+              </w:rPr>
+              <w:t>er dedicarles horas al proyecto</w:t>
+            </w:r>
+            <w:r>
+              <w:rPr>
+                <w:rFonts w:cstheme="minorHAnsi"/>
+                <w:b/>
+                <w:bCs/>
+                <w:color w:val="1F4E79" w:themeColor="accent1" w:themeShade="80"/>
+                <w:sz w:val="24"/>
+                <w:szCs w:val="24"/>
+              </w:rPr>
+              <w:t xml:space="preserve"> para no retrasarme. Además, he mantenido una comunica</w:t>
+            </w:r>
+            <w:r>
+              <w:rPr>
+                <w:rFonts w:cstheme="minorHAnsi"/>
+                <w:b/>
+                <w:bCs/>
+                <w:color w:val="1F4E79" w:themeColor="accent1" w:themeShade="80"/>
+                <w:sz w:val="24"/>
+                <w:szCs w:val="24"/>
+              </w:rPr>
+              <w:t>ción constante con mi compañero como dividir tareas complejas.</w:t>
+            </w:r>
+          </w:p>
+          <w:p>
+            <w:pPr>
+              <w:jc w:val="both"/>
+              <w:rPr>
+                <w:rFonts w:ascii="Calibri" w:hAnsi="Calibri"/>
+                <w:b/>
+                <w:bCs/>
+                <w:color w:val="1F4E79" w:themeColor="accent1" w:themeShade="80"/>
+              </w:rPr>
+            </w:pPr>
+          </w:p>
+          <w:p>
+            <w:pPr>
+              <w:jc w:val="both"/>
+              <w:rPr>
+                <w:rFonts w:ascii="Calibri" w:hAnsi="Calibri"/>
+                <w:b/>
+                <w:bCs/>
+                <w:color w:val="1F4E79" w:themeColor="accent1" w:themeShade="80"/>
+              </w:rPr>
+            </w:pPr>
+          </w:p>
+          <w:p>
+            <w:pPr>
+              <w:jc w:val="both"/>
+              <w:rPr>
+                <w:rFonts w:ascii="Calibri" w:hAnsi="Calibri"/>
+                <w:b/>
+                <w:bCs/>
+                <w:color w:val="1F4E79" w:themeColor="accent1" w:themeShade="80"/>
+              </w:rPr>
+            </w:pPr>
+          </w:p>
+          <w:p>
+            <w:pPr>
+              <w:jc w:val="both"/>
+              <w:rPr>
+                <w:rFonts w:ascii="Calibri" w:hAnsi="Calibri"/>
+                <w:b/>
+                <w:bCs/>
+                <w:color w:val="1F4E79" w:themeColor="accent1" w:themeShade="80"/>
+              </w:rPr>
+            </w:pPr>
+          </w:p>
+          <w:p>
+            <w:pPr>
+              <w:jc w:val="both"/>
+              <w:rPr>
                 <w:rFonts w:ascii="Calibri" w:hAnsi="Calibri"/>
                 <w:b/>
                 <w:bCs/>
@@ -558,6 +857,7 @@
                 <w:sz w:val="24"/>
                 <w:szCs w:val="24"/>
               </w:rPr>
+              <w:lastRenderedPageBreak/>
               <w:t>3. Hasta el momento:</w:t>
             </w:r>
           </w:p>
@@ -633,6 +933,109 @@
                 <w:color w:val="1F4E79" w:themeColor="accent1" w:themeShade="80"/>
               </w:rPr>
             </w:pPr>
+          </w:p>
+          <w:p>
+            <w:pPr>
+              <w:jc w:val="both"/>
+              <w:rPr>
+                <w:rFonts w:ascii="Calibri" w:hAnsi="Calibri"/>
+                <w:b/>
+                <w:bCs/>
+                <w:color w:val="1F4E79" w:themeColor="accent1" w:themeShade="80"/>
+              </w:rPr>
+            </w:pPr>
+            <w:r>
+              <w:rPr>
+                <w:rFonts w:ascii="Calibri" w:hAnsi="Calibri"/>
+                <w:b/>
+                <w:bCs/>
+                <w:color w:val="1F4E79" w:themeColor="accent1" w:themeShade="80"/>
+              </w:rPr>
+              <w:t xml:space="preserve">Evaluó mi trabajo </w:t>
+            </w:r>
+            <w:r>
+              <w:rPr>
+                <w:rFonts w:ascii="Calibri" w:hAnsi="Calibri"/>
+                <w:b/>
+                <w:bCs/>
+                <w:color w:val="1F4E79" w:themeColor="accent1" w:themeShade="80"/>
+              </w:rPr>
+              <w:t>de manera positiva</w:t>
+            </w:r>
+            <w:r>
+              <w:rPr>
+                <w:rFonts w:ascii="Calibri" w:hAnsi="Calibri"/>
+                <w:b/>
+                <w:bCs/>
+                <w:color w:val="1F4E79" w:themeColor="accent1" w:themeShade="80"/>
+              </w:rPr>
+              <w:t xml:space="preserve"> donde he </w:t>
+            </w:r>
+            <w:r>
+              <w:rPr>
+                <w:rFonts w:ascii="Calibri" w:hAnsi="Calibri"/>
+                <w:b/>
+                <w:bCs/>
+                <w:color w:val="1F4E79" w:themeColor="accent1" w:themeShade="80"/>
+              </w:rPr>
+              <w:t xml:space="preserve">sido responsable con las tareas </w:t>
+            </w:r>
+            <w:r>
+              <w:rPr>
+                <w:rFonts w:ascii="Calibri" w:hAnsi="Calibri"/>
+                <w:b/>
+                <w:bCs/>
+                <w:color w:val="1F4E79" w:themeColor="accent1" w:themeShade="80"/>
+              </w:rPr>
+              <w:t>asignadas he aportado constante y significativa al desarrollo del proyecto.</w:t>
+            </w:r>
+          </w:p>
+          <w:p>
+            <w:pPr>
+              <w:jc w:val="both"/>
+              <w:rPr>
+                <w:rFonts w:ascii="Calibri" w:hAnsi="Calibri"/>
+                <w:b/>
+                <w:bCs/>
+                <w:color w:val="1F4E79" w:themeColor="accent1" w:themeShade="80"/>
+              </w:rPr>
+            </w:pPr>
+            <w:r>
+              <w:rPr>
+                <w:rFonts w:ascii="Calibri" w:hAnsi="Calibri"/>
+                <w:b/>
+                <w:bCs/>
+                <w:color w:val="1F4E79" w:themeColor="accent1" w:themeShade="80"/>
+              </w:rPr>
+              <w:t>Que aspectos destaco la claridad al modelar los procesos del SOC, capacidad de adaptar la arquitectura en nuevas necesidades.</w:t>
+            </w:r>
+            <w:r>
+              <w:rPr>
+                <w:rFonts w:ascii="Calibri" w:hAnsi="Calibri"/>
+                <w:b/>
+                <w:bCs/>
+                <w:color w:val="1F4E79" w:themeColor="accent1" w:themeShade="80"/>
+              </w:rPr>
+              <w:t xml:space="preserve"> </w:t>
+            </w:r>
+            <w:r>
+              <w:rPr>
+                <w:rFonts w:ascii="Calibri" w:hAnsi="Calibri"/>
+                <w:b/>
+                <w:bCs/>
+                <w:color w:val="1F4E79" w:themeColor="accent1" w:themeShade="80"/>
+              </w:rPr>
+              <w:t xml:space="preserve">Cosas que puedo mejora es optimizar los tiempos de </w:t>
+            </w:r>
+            <w:r>
+              <w:rPr>
+                <w:rFonts w:ascii="Calibri" w:hAnsi="Calibri"/>
+                <w:b/>
+                <w:bCs/>
+                <w:color w:val="1F4E79" w:themeColor="accent1" w:themeShade="80"/>
+              </w:rPr>
+              <w:t>trabajos laborales con el proyecto APT.</w:t>
+            </w:r>
           </w:p>
           <w:p>
             <w:pPr>
@@ -733,7 +1136,6 @@
                 <w:sz w:val="24"/>
                 <w:szCs w:val="24"/>
               </w:rPr>
-              <w:lastRenderedPageBreak/>
               <w:t>¿Qué inquietudes te quedan sobre cómo proceder? ¿Qué pregunta te gustaría hacerle a tu docente o a tus pares?</w:t>
             </w:r>
           </w:p>
@@ -758,6 +1160,69 @@
                 <w:color w:val="1F4E79" w:themeColor="accent1" w:themeShade="80"/>
               </w:rPr>
             </w:pPr>
+            <w:r>
+              <w:rPr>
+                <w:rFonts w:ascii="Calibri" w:hAnsi="Calibri"/>
+                <w:b/>
+                <w:bCs/>
+                <w:color w:val="1F4E79" w:themeColor="accent1" w:themeShade="80"/>
+              </w:rPr>
+              <w:t xml:space="preserve">Me queda la inquietud de </w:t>
+            </w:r>
+            <w:r>
+              <w:rPr>
+                <w:rFonts w:ascii="Calibri" w:hAnsi="Calibri"/>
+                <w:b/>
+                <w:bCs/>
+                <w:color w:val="1F4E79" w:themeColor="accent1" w:themeShade="80"/>
+              </w:rPr>
+              <w:t xml:space="preserve">que </w:t>
+            </w:r>
+            <w:r>
+              <w:rPr>
+                <w:rFonts w:ascii="Calibri" w:hAnsi="Calibri"/>
+                <w:b/>
+                <w:bCs/>
+                <w:color w:val="1F4E79" w:themeColor="accent1" w:themeShade="80"/>
+              </w:rPr>
+              <w:t xml:space="preserve">si la arquitectura definida para el </w:t>
+            </w:r>
+            <w:r>
+              <w:rPr>
+                <w:rFonts w:ascii="Calibri" w:hAnsi="Calibri"/>
+                <w:b/>
+                <w:bCs/>
+                <w:color w:val="1F4E79" w:themeColor="accent1" w:themeShade="80"/>
+              </w:rPr>
+              <w:t xml:space="preserve">sistema </w:t>
+            </w:r>
+            <w:r>
+              <w:rPr>
+                <w:rFonts w:ascii="Calibri" w:hAnsi="Calibri"/>
+                <w:b/>
+                <w:bCs/>
+                <w:color w:val="1F4E79" w:themeColor="accent1" w:themeShade="80"/>
+              </w:rPr>
+              <w:t xml:space="preserve">SOC es los suficientemente escalable para integrar nuevos módulos y la capacidad de cumplir todas las funcionalidades. </w:t>
+            </w:r>
+            <w:r>
+              <w:rPr>
+                <w:rFonts w:ascii="Calibri" w:hAnsi="Calibri"/>
+                <w:b/>
+                <w:bCs/>
+                <w:color w:val="1F4E79" w:themeColor="accent1" w:themeShade="80"/>
+              </w:rPr>
+              <w:t>También me preocupa asegura sí que estamos priorizando correctamente las tareas más importantes para evitar que</w:t>
+            </w:r>
+            <w:r>
+              <w:rPr>
+                <w:rFonts w:ascii="Calibri" w:hAnsi="Calibri"/>
+                <w:b/>
+                <w:bCs/>
+                <w:color w:val="1F4E79" w:themeColor="accent1" w:themeShade="80"/>
+              </w:rPr>
+              <w:t xml:space="preserve"> los módulos queden funcionalidades críticas para el final.</w:t>
+            </w:r>
           </w:p>
           <w:p>
             <w:pPr>
@@ -769,6 +1234,15 @@
                 <w:color w:val="1F4E79" w:themeColor="accent1" w:themeShade="80"/>
               </w:rPr>
             </w:pPr>
+            <w:r>
+              <w:rPr>
+                <w:rFonts w:ascii="Calibri" w:hAnsi="Calibri"/>
+                <w:b/>
+                <w:bCs/>
+                <w:color w:val="1F4E79" w:themeColor="accent1" w:themeShade="80"/>
+              </w:rPr>
+              <w:t>Mi pregunta principal para el docente de, ¿El nivel de detalle de modelamiento es suficiente para la evaluación o requiere mayor granularidad?</w:t>
+            </w:r>
           </w:p>
         </w:tc>
       </w:tr>
@@ -877,11 +1351,20 @@
               <w:jc w:val="both"/>
               <w:rPr>
                 <w:rFonts w:eastAsiaTheme="majorEastAsia"/>
-                <w:color w:val="767171" w:themeColor="background2" w:themeShade="80"/>
+                <w:color w:val="1F4E79" w:themeColor="accent1" w:themeShade="80"/>
                 <w:sz w:val="24"/>
                 <w:szCs w:val="24"/>
               </w:rPr>
             </w:pPr>
+            <w:r>
+              <w:rPr>
+                <w:rFonts w:eastAsiaTheme="majorEastAsia"/>
+                <w:color w:val="1F4E79" w:themeColor="accent1" w:themeShade="80"/>
+                <w:sz w:val="24"/>
+                <w:szCs w:val="24"/>
+              </w:rPr>
+              <w:t>Desde mi perspectiva, estamos cumpliendo adecuadamente con nuestras responsabilidades, por lo que no considero necesario redistribuir actividades en este momento. Hemos demostrado compromiso, buenas habilidades y continuidad en el trabajo asignado.</w:t>
+            </w:r>
           </w:p>
           <w:p>
             <w:pPr>
@@ -897,6 +1380,66 @@
         </w:tc>
       </w:tr>
     </w:tbl>
+    <w:p>
+      <w:pPr>
+        <w:spacing w:after="0" w:line="360" w:lineRule="auto"/>
+        <w:jc w:val="both"/>
+        <w:rPr>
+          <w:b/>
+          <w:bCs/>
+          <w:sz w:val="24"/>
+          <w:szCs w:val="24"/>
+        </w:rPr>
+      </w:pPr>
+    </w:p>
+    <w:p>
+      <w:pPr>
+        <w:spacing w:after="0" w:line="360" w:lineRule="auto"/>
+        <w:jc w:val="both"/>
+        <w:rPr>
+          <w:b/>
+          <w:bCs/>
+          <w:sz w:val="24"/>
+          <w:szCs w:val="24"/>
+        </w:rPr>
+      </w:pPr>
+    </w:p>
+    <w:p>
+      <w:pPr>
+        <w:spacing w:after="0" w:line="360" w:lineRule="auto"/>
+        <w:jc w:val="both"/>
+        <w:rPr>
+          <w:b/>
+          <w:bCs/>
+          <w:sz w:val="24"/>
+          <w:szCs w:val="24"/>
+        </w:rPr>
+      </w:pPr>
+    </w:p>
+    <w:p>
+      <w:pPr>
+        <w:spacing w:after="0" w:line="360" w:lineRule="auto"/>
+        <w:jc w:val="both"/>
+        <w:rPr>
+          <w:b/>
+          <w:bCs/>
+          <w:sz w:val="24"/>
+          <w:szCs w:val="24"/>
+        </w:rPr>
+      </w:pPr>
+    </w:p>
+    <w:p>
+      <w:pPr>
+        <w:spacing w:after="0" w:line="360" w:lineRule="auto"/>
+        <w:jc w:val="both"/>
+        <w:rPr>
+          <w:b/>
+          <w:bCs/>
+          <w:sz w:val="24"/>
+          <w:szCs w:val="24"/>
+        </w:rPr>
+      </w:pPr>
+    </w:p>
     <w:p>
       <w:pPr>
         <w:spacing w:after="0" w:line="360" w:lineRule="auto"/>
@@ -976,6 +1519,7 @@
                 <w:sz w:val="24"/>
                 <w:szCs w:val="24"/>
               </w:rPr>
+              <w:lastRenderedPageBreak/>
               <w:t>6</w:t>
             </w:r>
             <w:r>
@@ -984,18 +1528,8 @@
                 <w:sz w:val="24"/>
                 <w:szCs w:val="24"/>
               </w:rPr>
-              <w:t xml:space="preserve">. </w:t>
+              <w:t>. APT  grupal</w:t>
             </w:r>
-            <w:proofErr w:type="gramStart"/>
-            <w:r>
-              <w:rPr>
-                <w:rFonts w:eastAsiaTheme="majorEastAsia"/>
-                <w:sz w:val="24"/>
-                <w:szCs w:val="24"/>
-              </w:rPr>
-              <w:t>APT  grupal</w:t>
-            </w:r>
-            <w:proofErr w:type="gramEnd"/>
           </w:p>
         </w:tc>
       </w:tr>
@@ -1040,11 +1574,145 @@
           </w:p>
           <w:p>
             <w:pPr>
-              <w:ind w:left="720"/>
               <w:jc w:val="both"/>
               <w:rPr>
                 <w:rFonts w:eastAsiaTheme="majorEastAsia"/>
-                <w:color w:val="767171" w:themeColor="background2" w:themeShade="80"/>
+                <w:color w:val="1F4E79" w:themeColor="accent1" w:themeShade="80"/>
+                <w:sz w:val="24"/>
+                <w:szCs w:val="24"/>
+              </w:rPr>
+            </w:pPr>
+            <w:r>
+              <w:rPr>
+                <w:rFonts w:eastAsiaTheme="majorEastAsia"/>
+                <w:color w:val="1F4E79" w:themeColor="accent1" w:themeShade="80"/>
+                <w:sz w:val="24"/>
+                <w:szCs w:val="24"/>
+              </w:rPr>
+              <w:t xml:space="preserve">Evaluamos el trabajo grupal como positivo, ya que hemos logrado mantener comunicación continua y dividir el trabajo de forma equilibrada. </w:t>
+            </w:r>
+          </w:p>
+          <w:p>
+            <w:pPr>
+              <w:jc w:val="both"/>
+              <w:rPr>
+                <w:rFonts w:eastAsiaTheme="majorEastAsia"/>
+                <w:color w:val="1F4E79" w:themeColor="accent1" w:themeShade="80"/>
+                <w:sz w:val="24"/>
+                <w:szCs w:val="24"/>
+              </w:rPr>
+            </w:pPr>
+            <w:r>
+              <w:rPr>
+                <w:rFonts w:eastAsiaTheme="majorEastAsia"/>
+                <w:color w:val="1F4E79" w:themeColor="accent1" w:themeShade="80"/>
+                <w:sz w:val="24"/>
+                <w:szCs w:val="24"/>
+              </w:rPr>
+              <w:t>Aspectos positivos:</w:t>
+            </w:r>
+          </w:p>
+          <w:p>
+            <w:pPr>
+              <w:jc w:val="both"/>
+              <w:rPr>
+                <w:rFonts w:eastAsiaTheme="majorEastAsia"/>
+                <w:color w:val="1F4E79" w:themeColor="accent1" w:themeShade="80"/>
+                <w:sz w:val="24"/>
+                <w:szCs w:val="24"/>
+              </w:rPr>
+            </w:pPr>
+          </w:p>
+          <w:p>
+            <w:pPr>
+              <w:pStyle w:val="Prrafodelista"/>
+              <w:numPr>
+                <w:ilvl w:val="0"/>
+                <w:numId w:val="44"/>
+              </w:numPr>
+              <w:jc w:val="both"/>
+              <w:rPr>
+                <w:rFonts w:eastAsiaTheme="majorEastAsia"/>
+                <w:color w:val="1F4E79" w:themeColor="accent1" w:themeShade="80"/>
+                <w:sz w:val="24"/>
+                <w:szCs w:val="24"/>
+              </w:rPr>
+            </w:pPr>
+            <w:r>
+              <w:rPr>
+                <w:rFonts w:eastAsiaTheme="majorEastAsia"/>
+                <w:color w:val="1F4E79" w:themeColor="accent1" w:themeShade="80"/>
+                <w:sz w:val="24"/>
+                <w:szCs w:val="24"/>
+              </w:rPr>
+              <w:t>Buena coordinación y disposición</w:t>
+            </w:r>
+            <w:r>
+              <w:rPr>
+                <w:rFonts w:eastAsiaTheme="majorEastAsia"/>
+                <w:color w:val="1F4E79" w:themeColor="accent1" w:themeShade="80"/>
+                <w:sz w:val="24"/>
+                <w:szCs w:val="24"/>
+              </w:rPr>
+              <w:t xml:space="preserve"> para coordinar avances y resolver dudas.</w:t>
+            </w:r>
+          </w:p>
+          <w:p>
+            <w:pPr>
+              <w:pStyle w:val="Prrafodelista"/>
+              <w:numPr>
+                <w:ilvl w:val="0"/>
+                <w:numId w:val="44"/>
+              </w:numPr>
+              <w:jc w:val="both"/>
+              <w:rPr>
+                <w:rFonts w:eastAsiaTheme="majorEastAsia"/>
+                <w:color w:val="1F4E79" w:themeColor="accent1" w:themeShade="80"/>
+                <w:sz w:val="24"/>
+                <w:szCs w:val="24"/>
+              </w:rPr>
+            </w:pPr>
+            <w:r>
+              <w:rPr>
+                <w:rFonts w:eastAsiaTheme="majorEastAsia"/>
+                <w:color w:val="1F4E79" w:themeColor="accent1" w:themeShade="80"/>
+                <w:sz w:val="24"/>
+                <w:szCs w:val="24"/>
+              </w:rPr>
+              <w:t>Responsabilidad y cumplimiento de tareas asignadas.</w:t>
+            </w:r>
+          </w:p>
+          <w:p>
+            <w:pPr>
+              <w:pStyle w:val="Prrafodelista"/>
+              <w:numPr>
+                <w:ilvl w:val="0"/>
+                <w:numId w:val="44"/>
+              </w:numPr>
+              <w:jc w:val="both"/>
+              <w:rPr>
+                <w:rFonts w:eastAsiaTheme="majorEastAsia"/>
+                <w:color w:val="1F4E79" w:themeColor="accent1" w:themeShade="80"/>
+                <w:sz w:val="24"/>
+                <w:szCs w:val="24"/>
+              </w:rPr>
+            </w:pPr>
+            <w:r>
+              <w:rPr>
+                <w:rFonts w:eastAsiaTheme="majorEastAsia"/>
+                <w:color w:val="1F4E79" w:themeColor="accent1" w:themeShade="80"/>
+                <w:sz w:val="24"/>
+                <w:szCs w:val="24"/>
+              </w:rPr>
+              <w:t>Capacidad para resolver dudas y apoyarnos entre nosotros.</w:t>
+            </w:r>
+          </w:p>
+          <w:p>
+            <w:pPr>
+              <w:jc w:val="both"/>
+              <w:rPr>
+                <w:rFonts w:eastAsiaTheme="majorEastAsia"/>
+                <w:color w:val="1F4E79" w:themeColor="accent1" w:themeShade="80"/>
                 <w:sz w:val="24"/>
                 <w:szCs w:val="24"/>
               </w:rPr>
@@ -1054,10 +1722,139 @@
             <w:pPr>
               <w:jc w:val="both"/>
               <w:rPr>
+                <w:rFonts w:eastAsiaTheme="majorEastAsia"/>
+                <w:color w:val="1F4E79" w:themeColor="accent1" w:themeShade="80"/>
+                <w:sz w:val="24"/>
+                <w:szCs w:val="24"/>
+              </w:rPr>
+            </w:pPr>
+            <w:r>
+              <w:rPr>
+                <w:rFonts w:eastAsiaTheme="majorEastAsia"/>
+                <w:color w:val="1F4E79" w:themeColor="accent1" w:themeShade="80"/>
+                <w:sz w:val="24"/>
+                <w:szCs w:val="24"/>
+              </w:rPr>
+              <w:t>Aspectos a mejorar:</w:t>
+            </w:r>
+          </w:p>
+          <w:p>
+            <w:pPr>
+              <w:pStyle w:val="Prrafodelista"/>
+              <w:numPr>
+                <w:ilvl w:val="0"/>
+                <w:numId w:val="45"/>
+              </w:numPr>
+              <w:jc w:val="both"/>
+              <w:rPr>
+                <w:rFonts w:eastAsiaTheme="majorEastAsia"/>
+                <w:color w:val="1F4E79" w:themeColor="accent1" w:themeShade="80"/>
+                <w:sz w:val="24"/>
+                <w:szCs w:val="24"/>
+              </w:rPr>
+            </w:pPr>
+            <w:r>
+              <w:rPr>
+                <w:rFonts w:eastAsiaTheme="majorEastAsia"/>
+                <w:color w:val="1F4E79" w:themeColor="accent1" w:themeShade="80"/>
+                <w:sz w:val="24"/>
+                <w:szCs w:val="24"/>
+              </w:rPr>
+              <w:t>Aumentar la frecuencia de reuniones para alinear avances.</w:t>
+            </w:r>
+          </w:p>
+          <w:p>
+            <w:pPr>
+              <w:pStyle w:val="Prrafodelista"/>
+              <w:numPr>
+                <w:ilvl w:val="0"/>
+                <w:numId w:val="45"/>
+              </w:numPr>
+              <w:jc w:val="both"/>
+              <w:rPr>
+                <w:rFonts w:eastAsiaTheme="majorEastAsia"/>
+                <w:color w:val="1F4E79" w:themeColor="accent1" w:themeShade="80"/>
+                <w:sz w:val="24"/>
+                <w:szCs w:val="24"/>
+              </w:rPr>
+            </w:pPr>
+            <w:r>
+              <w:rPr>
+                <w:rFonts w:eastAsiaTheme="majorEastAsia"/>
+                <w:color w:val="1F4E79" w:themeColor="accent1" w:themeShade="80"/>
+                <w:sz w:val="24"/>
+                <w:szCs w:val="24"/>
+              </w:rPr>
+              <w:t>Reforzar mi planificación personal para evitar momentos de sobrecarga, especialmente considerando mis responsabilidades laborales.</w:t>
+            </w:r>
+          </w:p>
+          <w:p>
+            <w:pPr>
+              <w:pStyle w:val="Prrafodelista"/>
+              <w:numPr>
+                <w:ilvl w:val="0"/>
+                <w:numId w:val="45"/>
+              </w:numPr>
+              <w:jc w:val="both"/>
+              <w:rPr>
+                <w:rFonts w:eastAsiaTheme="majorEastAsia"/>
+                <w:color w:val="1F4E79" w:themeColor="accent1" w:themeShade="80"/>
+                <w:sz w:val="24"/>
+                <w:szCs w:val="24"/>
+              </w:rPr>
+            </w:pPr>
+            <w:r>
+              <w:rPr>
+                <w:rFonts w:eastAsiaTheme="majorEastAsia"/>
+                <w:color w:val="1F4E79" w:themeColor="accent1" w:themeShade="80"/>
+                <w:sz w:val="24"/>
+                <w:szCs w:val="24"/>
+              </w:rPr>
+              <w:t>Anticipar posibles dificultades técnicas o de tiempo para comunicar con mayor antelación si necesito apoyo.</w:t>
+            </w:r>
+            <w:bookmarkStart w:id="0" w:name="_GoBack"/>
+            <w:bookmarkEnd w:id="0"/>
+          </w:p>
+          <w:p>
+            <w:pPr>
+              <w:jc w:val="both"/>
+              <w:rPr>
+                <w:rFonts w:eastAsiaTheme="majorEastAsia"/>
+                <w:color w:val="1F4E79" w:themeColor="accent1" w:themeShade="80"/>
+                <w:sz w:val="24"/>
+                <w:szCs w:val="24"/>
+              </w:rPr>
+            </w:pPr>
+          </w:p>
+          <w:p>
+            <w:pPr>
+              <w:jc w:val="both"/>
+              <w:rPr>
                 <w:rFonts w:ascii="Calibri" w:hAnsi="Calibri"/>
                 <w:b/>
                 <w:bCs/>
                 <w:color w:val="1F4E79" w:themeColor="accent1" w:themeShade="80"/>
+              </w:rPr>
+            </w:pPr>
+          </w:p>
+        </w:tc>
+      </w:tr>
+      <w:tr>
+        <w:trPr>
+          <w:trHeight w:val="1639"/>
+        </w:trPr>
+        <w:tc>
+          <w:tcPr>
+            <w:tcW w:w="10076" w:type="dxa"/>
+            <w:vAlign w:val="center"/>
+          </w:tcPr>
+          <w:p>
+            <w:pPr>
+              <w:jc w:val="both"/>
+              <w:rPr>
+                <w:rFonts w:eastAsiaTheme="majorEastAsia"/>
+                <w:sz w:val="24"/>
+                <w:szCs w:val="24"/>
               </w:rPr>
             </w:pPr>
           </w:p>
@@ -1103,7 +1900,7 @@
 </file>
 
 <file path=word/endnotes.xml><?xml version="1.0" encoding="utf-8"?>
-<w:endnotes xmlns:wpc="http://schemas.microsoft.com/office/word/2010/wordprocessingCanvas" xmlns:cx="http://schemas.microsoft.com/office/drawing/2014/chartex" xmlns:cx1="http://schemas.microsoft.com/office/drawing/2015/9/8/chartex" xmlns:cx2="http://schemas.microsoft.com/office/drawing/2015/10/21/chartex" xmlns:cx3="http://schemas.microsoft.com/office/drawing/2016/5/9/chartex" xmlns:cx4="http://schemas.microsoft.com/office/drawing/2016/5/10/chartex" xmlns:cx5="http://schemas.microsoft.com/office/drawing/2016/5/11/chartex" xmlns:cx6="http://schemas.microsoft.com/office/drawing/2016/5/12/chartex" xmlns:cx7="http://schemas.microsoft.com/office/drawing/2016/5/13/chartex" xmlns:cx8="http://schemas.microsoft.com/office/drawing/2016/5/14/chartex" xmlns:mc="http://schemas.openxmlformats.org/markup-compatibility/2006" xmlns:aink="http://schemas.microsoft.com/office/drawing/2016/ink" xmlns:am3d="http://schemas.microsoft.com/office/drawing/2017/model3d" xmlns:o="urn:schemas-microsoft-com:office:office" xmlns:oel="http://schemas.microsoft.com/office/2019/extlst" xmlns:r="http://schemas.openxmlformats.org/officeDocument/2006/relationships" xmlns:m="http://schemas.openxmlformats.org/officeDocument/2006/math" xmlns:v="urn:schemas-microsoft-com:vml" xmlns:wp14="http://schemas.microsoft.com/office/word/2010/wordprocessingDrawing" xmlns:wp="http://schemas.openxmlformats.org/drawingml/2006/wordprocessingDrawing" xmlns:w10="urn:schemas-microsoft-com:office:word" xmlns:w="http://schemas.openxmlformats.org/wordprocessingml/2006/main" xmlns:w14="http://schemas.microsoft.com/office/word/2010/wordml" xmlns:w15="http://schemas.microsoft.com/office/word/2012/wordml" xmlns:w16cex="http://schemas.microsoft.com/office/word/2018/wordml/cex" xmlns:w16cid="http://schemas.microsoft.com/office/word/2016/wordml/cid" xmlns:w16="http://schemas.microsoft.com/office/word/2018/wordml" xmlns:w16du="http://schemas.microsoft.com/office/word/2023/wordml/word16du" xmlns:w16sdtdh="http://schemas.microsoft.com/office/word/2020/wordml/sdtdatahash" xmlns:w16sdtfl="http://schemas.microsoft.com/office/word/2024/wordml/sdtformatlock" xmlns:w16se="http://schemas.microsoft.com/office/word/2015/wordml/symex" xmlns:wpg="http://schemas.microsoft.com/office/word/2010/wordprocessingGroup" xmlns:wpi="http://schemas.microsoft.com/office/word/2010/wordprocessingInk" xmlns:wne="http://schemas.microsoft.com/office/word/2006/wordml" xmlns:wps="http://schemas.microsoft.com/office/word/2010/wordprocessingShape" mc:Ignorable="w14 w15 w16se w16cid w16 w16cex w16sdtdh w16sdtfl w16du wp14">
+<w:endnotes xmlns:wpc="http://schemas.microsoft.com/office/word/2010/wordprocessingCanvas" xmlns:cx="http://schemas.microsoft.com/office/drawing/2014/chartex" xmlns:mc="http://schemas.openxmlformats.org/markup-compatibility/2006" xmlns:o="urn:schemas-microsoft-com:office:office" xmlns:r="http://schemas.openxmlformats.org/officeDocument/2006/relationships" xmlns:m="http://schemas.openxmlformats.org/officeDocument/2006/math" xmlns:v="urn:schemas-microsoft-com:vml" xmlns:wp14="http://schemas.microsoft.com/office/word/2010/wordprocessingDrawing" xmlns:wp="http://schemas.openxmlformats.org/drawingml/2006/wordprocessingDrawing" xmlns:w10="urn:schemas-microsoft-com:office:word" xmlns:w="http://schemas.openxmlformats.org/wordprocessingml/2006/main" xmlns:w14="http://schemas.microsoft.com/office/word/2010/wordml" xmlns:w15="http://schemas.microsoft.com/office/word/2012/wordml" xmlns:w16se="http://schemas.microsoft.com/office/word/2015/wordml/symex" xmlns:wpg="http://schemas.microsoft.com/office/word/2010/wordprocessingGroup" xmlns:wpi="http://schemas.microsoft.com/office/word/2010/wordprocessingInk" xmlns:wne="http://schemas.microsoft.com/office/word/2006/wordml" xmlns:wps="http://schemas.microsoft.com/office/word/2010/wordprocessingShape" mc:Ignorable="w14 w15 w16se wp14">
   <w:endnote w:type="separator" w:id="-1">
     <w:p>
       <w:pPr>
@@ -1128,7 +1925,7 @@
 </file>
 
 <file path=word/footer1.xml><?xml version="1.0" encoding="utf-8"?>
-<w:ftr xmlns:wpc="http://schemas.microsoft.com/office/word/2010/wordprocessingCanvas" xmlns:cx="http://schemas.microsoft.com/office/drawing/2014/chartex" xmlns:cx1="http://schemas.microsoft.com/office/drawing/2015/9/8/chartex" xmlns:cx2="http://schemas.microsoft.com/office/drawing/2015/10/21/chartex" xmlns:cx3="http://schemas.microsoft.com/office/drawing/2016/5/9/chartex" xmlns:cx4="http://schemas.microsoft.com/office/drawing/2016/5/10/chartex" xmlns:cx5="http://schemas.microsoft.com/office/drawing/2016/5/11/chartex" xmlns:cx6="http://schemas.microsoft.com/office/drawing/2016/5/12/chartex" xmlns:cx7="http://schemas.microsoft.com/office/drawing/2016/5/13/chartex" xmlns:cx8="http://schemas.microsoft.com/office/drawing/2016/5/14/chartex" xmlns:mc="http://schemas.openxmlformats.org/markup-compatibility/2006" xmlns:aink="http://schemas.microsoft.com/office/drawing/2016/ink" xmlns:am3d="http://schemas.microsoft.com/office/drawing/2017/model3d" xmlns:o="urn:schemas-microsoft-com:office:office" xmlns:oel="http://schemas.microsoft.com/office/2019/extlst" xmlns:r="http://schemas.openxmlformats.org/officeDocument/2006/relationships" xmlns:m="http://schemas.openxmlformats.org/officeDocument/2006/math" xmlns:v="urn:schemas-microsoft-com:vml" xmlns:wp14="http://schemas.microsoft.com/office/word/2010/wordprocessingDrawing" xmlns:wp="http://schemas.openxmlformats.org/drawingml/2006/wordprocessingDrawing" xmlns:w10="urn:schemas-microsoft-com:office:word" xmlns:w="http://schemas.openxmlformats.org/wordprocessingml/2006/main" xmlns:w14="http://schemas.microsoft.com/office/word/2010/wordml" xmlns:w15="http://schemas.microsoft.com/office/word/2012/wordml" xmlns:w16cex="http://schemas.microsoft.com/office/word/2018/wordml/cex" xmlns:w16cid="http://schemas.microsoft.com/office/word/2016/wordml/cid" xmlns:w16="http://schemas.microsoft.com/office/word/2018/wordml" xmlns:w16du="http://schemas.microsoft.com/office/word/2023/wordml/word16du" xmlns:w16sdtdh="http://schemas.microsoft.com/office/word/2020/wordml/sdtdatahash" xmlns:w16sdtfl="http://schemas.microsoft.com/office/word/2024/wordml/sdtformatlock" xmlns:w16se="http://schemas.microsoft.com/office/word/2015/wordml/symex" xmlns:wpg="http://schemas.microsoft.com/office/word/2010/wordprocessingGroup" xmlns:wpi="http://schemas.microsoft.com/office/word/2010/wordprocessingInk" xmlns:wne="http://schemas.microsoft.com/office/word/2006/wordml" xmlns:wps="http://schemas.microsoft.com/office/word/2010/wordprocessingShape" mc:Ignorable="w14 w15 w16se w16cid w16 w16cex w16sdtdh w16sdtfl w16du wp14">
+<w:ftr xmlns:wpc="http://schemas.microsoft.com/office/word/2010/wordprocessingCanvas" xmlns:cx="http://schemas.microsoft.com/office/drawing/2014/chartex" xmlns:mc="http://schemas.openxmlformats.org/markup-compatibility/2006" xmlns:o="urn:schemas-microsoft-com:office:office" xmlns:r="http://schemas.openxmlformats.org/officeDocument/2006/relationships" xmlns:m="http://schemas.openxmlformats.org/officeDocument/2006/math" xmlns:v="urn:schemas-microsoft-com:vml" xmlns:wp14="http://schemas.microsoft.com/office/word/2010/wordprocessingDrawing" xmlns:wp="http://schemas.openxmlformats.org/drawingml/2006/wordprocessingDrawing" xmlns:w10="urn:schemas-microsoft-com:office:word" xmlns:w="http://schemas.openxmlformats.org/wordprocessingml/2006/main" xmlns:w14="http://schemas.microsoft.com/office/word/2010/wordml" xmlns:w15="http://schemas.microsoft.com/office/word/2012/wordml" xmlns:w16se="http://schemas.microsoft.com/office/word/2015/wordml/symex" xmlns:wpg="http://schemas.microsoft.com/office/word/2010/wordprocessingGroup" xmlns:wpi="http://schemas.microsoft.com/office/word/2010/wordprocessingInk" xmlns:wne="http://schemas.microsoft.com/office/word/2006/wordml" xmlns:wps="http://schemas.microsoft.com/office/word/2010/wordprocessingShape" mc:Ignorable="w14 w15 w16se wp14">
   <w:sdt>
     <w:sdtPr>
       <w:id w:val="-937982979"/>
@@ -1137,6 +1934,7 @@
         <w:docPartUnique/>
       </w:docPartObj>
     </w:sdtPr>
+    <w:sdtEndPr/>
     <w:sdtContent>
       <w:p>
         <w:pPr>
@@ -1145,7 +1943,7 @@
         <w:r>
           <w:rPr>
             <w:noProof/>
-            <w:lang w:eastAsia="es-CL"/>
+            <w:lang w:val="en-US"/>
           </w:rPr>
           <mc:AlternateContent>
             <mc:Choice Requires="wpg">
@@ -1237,7 +2035,7 @@
                                     <w:color w:val="8C8C8C" w:themeColor="background1" w:themeShade="8C"/>
                                     <w:lang w:val="es-ES"/>
                                   </w:rPr>
-                                  <w:t>0</w:t>
+                                  <w:t>1</w:t>
                                 </w:r>
                                 <w:r>
                                   <w:rPr>
@@ -1348,7 +2146,7 @@
             </mc:Choice>
             <mc:Fallback>
               <w:pict>
-                <v:group w14:anchorId="51D00065" id="Grupo 32" o:spid="_x0000_s1026" style="position:absolute;margin-left:0;margin-top:0;width:610.5pt;height:15pt;z-index:251659264;mso-width-percent:1000;mso-position-horizontal:center;mso-position-horizontal-relative:page;mso-position-vertical:center;mso-position-vertical-relative:bottom-margin-area;mso-width-percent:1000" coordorigin=",14970" coordsize="12255,300" o:gfxdata="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">
+                <v:group w14:anchorId="51D00065" id="Grupo 32" o:spid="_x0000_s1026" style="position:absolute;margin-left:0;margin-top:0;width:610.5pt;height:15pt;z-index:251659264;mso-width-percent:1000;mso-position-horizontal:center;mso-position-horizontal-relative:page;mso-position-vertical:center;mso-position-vertical-relative:bottom-margin-area;mso-width-percent:1000" coordorigin=",14970" coordsize="12255,300" o:gfxdata="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">
                   <v:shapetype id="_x0000_t202" coordsize="21600,21600" o:spt="202" path="m,l,21600r21600,l21600,xe">
                     <v:stroke joinstyle="miter"/>
                     <v:path gradientshapeok="t" o:connecttype="rect"/>
@@ -1375,7 +2173,7 @@
                               <w:color w:val="8C8C8C" w:themeColor="background1" w:themeShade="8C"/>
                               <w:lang w:val="es-ES"/>
                             </w:rPr>
-                            <w:t>0</w:t>
+                            <w:t>1</w:t>
                           </w:r>
                           <w:r>
                             <w:rPr>
@@ -1415,7 +2213,7 @@
 </file>
 
 <file path=word/footnotes.xml><?xml version="1.0" encoding="utf-8"?>
-<w:footnotes xmlns:wpc="http://schemas.microsoft.com/office/word/2010/wordprocessingCanvas" xmlns:cx="http://schemas.microsoft.com/office/drawing/2014/chartex" xmlns:cx1="http://schemas.microsoft.com/office/drawing/2015/9/8/chartex" xmlns:cx2="http://schemas.microsoft.com/office/drawing/2015/10/21/chartex" xmlns:cx3="http://schemas.microsoft.com/office/drawing/2016/5/9/chartex" xmlns:cx4="http://schemas.microsoft.com/office/drawing/2016/5/10/chartex" xmlns:cx5="http://schemas.microsoft.com/office/drawing/2016/5/11/chartex" xmlns:cx6="http://schemas.microsoft.com/office/drawing/2016/5/12/chartex" xmlns:cx7="http://schemas.microsoft.com/office/drawing/2016/5/13/chartex" xmlns:cx8="http://schemas.microsoft.com/office/drawing/2016/5/14/chartex" xmlns:mc="http://schemas.openxmlformats.org/markup-compatibility/2006" xmlns:aink="http://schemas.microsoft.com/office/drawing/2016/ink" xmlns:am3d="http://schemas.microsoft.com/office/drawing/2017/model3d" xmlns:o="urn:schemas-microsoft-com:office:office" xmlns:oel="http://schemas.microsoft.com/office/2019/extlst" xmlns:r="http://schemas.openxmlformats.org/officeDocument/2006/relationships" xmlns:m="http://schemas.openxmlformats.org/officeDocument/2006/math" xmlns:v="urn:schemas-microsoft-com:vml" xmlns:wp14="http://schemas.microsoft.com/office/word/2010/wordprocessingDrawing" xmlns:wp="http://schemas.openxmlformats.org/drawingml/2006/wordprocessingDrawing" xmlns:w10="urn:schemas-microsoft-com:office:word" xmlns:w="http://schemas.openxmlformats.org/wordprocessingml/2006/main" xmlns:w14="http://schemas.microsoft.com/office/word/2010/wordml" xmlns:w15="http://schemas.microsoft.com/office/word/2012/wordml" xmlns:w16cex="http://schemas.microsoft.com/office/word/2018/wordml/cex" xmlns:w16cid="http://schemas.microsoft.com/office/word/2016/wordml/cid" xmlns:w16="http://schemas.microsoft.com/office/word/2018/wordml" xmlns:w16du="http://schemas.microsoft.com/office/word/2023/wordml/word16du" xmlns:w16sdtdh="http://schemas.microsoft.com/office/word/2020/wordml/sdtdatahash" xmlns:w16sdtfl="http://schemas.microsoft.com/office/word/2024/wordml/sdtformatlock" xmlns:w16se="http://schemas.microsoft.com/office/word/2015/wordml/symex" xmlns:wpg="http://schemas.microsoft.com/office/word/2010/wordprocessingGroup" xmlns:wpi="http://schemas.microsoft.com/office/word/2010/wordprocessingInk" xmlns:wne="http://schemas.microsoft.com/office/word/2006/wordml" xmlns:wps="http://schemas.microsoft.com/office/word/2010/wordprocessingShape" mc:Ignorable="w14 w15 w16se w16cid w16 w16cex w16sdtdh w16sdtfl w16du wp14">
+<w:footnotes xmlns:wpc="http://schemas.microsoft.com/office/word/2010/wordprocessingCanvas" xmlns:cx="http://schemas.microsoft.com/office/drawing/2014/chartex" xmlns:mc="http://schemas.openxmlformats.org/markup-compatibility/2006" xmlns:o="urn:schemas-microsoft-com:office:office" xmlns:r="http://schemas.openxmlformats.org/officeDocument/2006/relationships" xmlns:m="http://schemas.openxmlformats.org/officeDocument/2006/math" xmlns:v="urn:schemas-microsoft-com:vml" xmlns:wp14="http://schemas.microsoft.com/office/word/2010/wordprocessingDrawing" xmlns:wp="http://schemas.openxmlformats.org/drawingml/2006/wordprocessingDrawing" xmlns:w10="urn:schemas-microsoft-com:office:word" xmlns:w="http://schemas.openxmlformats.org/wordprocessingml/2006/main" xmlns:w14="http://schemas.microsoft.com/office/word/2010/wordml" xmlns:w15="http://schemas.microsoft.com/office/word/2012/wordml" xmlns:w16se="http://schemas.microsoft.com/office/word/2015/wordml/symex" xmlns:wpg="http://schemas.microsoft.com/office/word/2010/wordprocessingGroup" xmlns:wpi="http://schemas.microsoft.com/office/word/2010/wordprocessingInk" xmlns:wne="http://schemas.microsoft.com/office/word/2006/wordml" xmlns:wps="http://schemas.microsoft.com/office/word/2010/wordprocessingShape" mc:Ignorable="w14 w15 w16se wp14">
   <w:footnote w:type="separator" w:id="-1">
     <w:p>
       <w:pPr>
@@ -1440,7 +2238,7 @@
 </file>
 
 <file path=word/header1.xml><?xml version="1.0" encoding="utf-8"?>
-<w:hdr xmlns:wpc="http://schemas.microsoft.com/office/word/2010/wordprocessingCanvas" xmlns:cx="http://schemas.microsoft.com/office/drawing/2014/chartex" xmlns:cx1="http://schemas.microsoft.com/office/drawing/2015/9/8/chartex" xmlns:cx2="http://schemas.microsoft.com/office/drawing/2015/10/21/chartex" xmlns:cx3="http://schemas.microsoft.com/office/drawing/2016/5/9/chartex" xmlns:cx4="http://schemas.microsoft.com/office/drawing/2016/5/10/chartex" xmlns:cx5="http://schemas.microsoft.com/office/drawing/2016/5/11/chartex" xmlns:cx6="http://schemas.microsoft.com/office/drawing/2016/5/12/chartex" xmlns:cx7="http://schemas.microsoft.com/office/drawing/2016/5/13/chartex" xmlns:cx8="http://schemas.microsoft.com/office/drawing/2016/5/14/chartex" xmlns:mc="http://schemas.openxmlformats.org/markup-compatibility/2006" xmlns:aink="http://schemas.microsoft.com/office/drawing/2016/ink" xmlns:am3d="http://schemas.microsoft.com/office/drawing/2017/model3d" xmlns:o="urn:schemas-microsoft-com:office:office" xmlns:oel="http://schemas.microsoft.com/office/2019/extlst" xmlns:r="http://schemas.openxmlformats.org/officeDocument/2006/relationships" xmlns:m="http://schemas.openxmlformats.org/officeDocument/2006/math" xmlns:v="urn:schemas-microsoft-com:vml" xmlns:wp14="http://schemas.microsoft.com/office/word/2010/wordprocessingDrawing" xmlns:wp="http://schemas.openxmlformats.org/drawingml/2006/wordprocessingDrawing" xmlns:w10="urn:schemas-microsoft-com:office:word" xmlns:w="http://schemas.openxmlformats.org/wordprocessingml/2006/main" xmlns:w14="http://schemas.microsoft.com/office/word/2010/wordml" xmlns:w15="http://schemas.microsoft.com/office/word/2012/wordml" xmlns:w16cex="http://schemas.microsoft.com/office/word/2018/wordml/cex" xmlns:w16cid="http://schemas.microsoft.com/office/word/2016/wordml/cid" xmlns:w16="http://schemas.microsoft.com/office/word/2018/wordml" xmlns:w16du="http://schemas.microsoft.com/office/word/2023/wordml/word16du" xmlns:w16sdtdh="http://schemas.microsoft.com/office/word/2020/wordml/sdtdatahash" xmlns:w16sdtfl="http://schemas.microsoft.com/office/word/2024/wordml/sdtformatlock" xmlns:w16se="http://schemas.microsoft.com/office/word/2015/wordml/symex" xmlns:wpg="http://schemas.microsoft.com/office/word/2010/wordprocessingGroup" xmlns:wpi="http://schemas.microsoft.com/office/word/2010/wordprocessingInk" xmlns:wne="http://schemas.microsoft.com/office/word/2006/wordml" xmlns:wps="http://schemas.microsoft.com/office/word/2010/wordprocessingShape" mc:Ignorable="w14 w15 w16se w16cid w16 w16cex w16sdtdh w16sdtfl w16du wp14">
+<w:hdr xmlns:wpc="http://schemas.microsoft.com/office/word/2010/wordprocessingCanvas" xmlns:cx="http://schemas.microsoft.com/office/drawing/2014/chartex" xmlns:mc="http://schemas.openxmlformats.org/markup-compatibility/2006" xmlns:o="urn:schemas-microsoft-com:office:office" xmlns:r="http://schemas.openxmlformats.org/officeDocument/2006/relationships" xmlns:m="http://schemas.openxmlformats.org/officeDocument/2006/math" xmlns:v="urn:schemas-microsoft-com:vml" xmlns:wp14="http://schemas.microsoft.com/office/word/2010/wordprocessingDrawing" xmlns:wp="http://schemas.openxmlformats.org/drawingml/2006/wordprocessingDrawing" xmlns:w10="urn:schemas-microsoft-com:office:word" xmlns:w="http://schemas.openxmlformats.org/wordprocessingml/2006/main" xmlns:w14="http://schemas.microsoft.com/office/word/2010/wordml" xmlns:w15="http://schemas.microsoft.com/office/word/2012/wordml" xmlns:w16se="http://schemas.microsoft.com/office/word/2015/wordml/symex" xmlns:wpg="http://schemas.microsoft.com/office/word/2010/wordprocessingGroup" xmlns:wpi="http://schemas.microsoft.com/office/word/2010/wordprocessingInk" xmlns:wne="http://schemas.microsoft.com/office/word/2006/wordml" xmlns:wps="http://schemas.microsoft.com/office/word/2010/wordprocessingShape" mc:Ignorable="w14 w15 w16se wp14">
   <w:tbl>
     <w:tblPr>
       <w:tblStyle w:val="Tablaconcuadrcula"/>
@@ -1552,7 +2350,7 @@
           <w:r>
             <w:rPr>
               <w:noProof/>
-              <w:lang w:eastAsia="es-CL"/>
+              <w:lang w:val="en-US"/>
             </w:rPr>
             <w:drawing>
               <wp:inline distT="0" distB="0" distL="0" distR="0" wp14:anchorId="4468F50A" wp14:editId="098D6783">
@@ -1620,7 +2418,7 @@
 </file>
 
 <file path=word/header2.xml><?xml version="1.0" encoding="utf-8"?>
-<w:hdr xmlns:wpc="http://schemas.microsoft.com/office/word/2010/wordprocessingCanvas" xmlns:cx="http://schemas.microsoft.com/office/drawing/2014/chartex" xmlns:cx1="http://schemas.microsoft.com/office/drawing/2015/9/8/chartex" xmlns:cx2="http://schemas.microsoft.com/office/drawing/2015/10/21/chartex" xmlns:cx3="http://schemas.microsoft.com/office/drawing/2016/5/9/chartex" xmlns:cx4="http://schemas.microsoft.com/office/drawing/2016/5/10/chartex" xmlns:cx5="http://schemas.microsoft.com/office/drawing/2016/5/11/chartex" xmlns:cx6="http://schemas.microsoft.com/office/drawing/2016/5/12/chartex" xmlns:cx7="http://schemas.microsoft.com/office/drawing/2016/5/13/chartex" xmlns:cx8="http://schemas.microsoft.com/office/drawing/2016/5/14/chartex" xmlns:mc="http://schemas.openxmlformats.org/markup-compatibility/2006" xmlns:aink="http://schemas.microsoft.com/office/drawing/2016/ink" xmlns:am3d="http://schemas.microsoft.com/office/drawing/2017/model3d" xmlns:o="urn:schemas-microsoft-com:office:office" xmlns:oel="http://schemas.microsoft.com/office/2019/extlst" xmlns:r="http://schemas.openxmlformats.org/officeDocument/2006/relationships" xmlns:m="http://schemas.openxmlformats.org/officeDocument/2006/math" xmlns:v="urn:schemas-microsoft-com:vml" xmlns:wp14="http://schemas.microsoft.com/office/word/2010/wordprocessingDrawing" xmlns:wp="http://schemas.openxmlformats.org/drawingml/2006/wordprocessingDrawing" xmlns:w10="urn:schemas-microsoft-com:office:word" xmlns:w="http://schemas.openxmlformats.org/wordprocessingml/2006/main" xmlns:w14="http://schemas.microsoft.com/office/word/2010/wordml" xmlns:w15="http://schemas.microsoft.com/office/word/2012/wordml" xmlns:w16cex="http://schemas.microsoft.com/office/word/2018/wordml/cex" xmlns:w16cid="http://schemas.microsoft.com/office/word/2016/wordml/cid" xmlns:w16="http://schemas.microsoft.com/office/word/2018/wordml" xmlns:w16du="http://schemas.microsoft.com/office/word/2023/wordml/word16du" xmlns:w16sdtdh="http://schemas.microsoft.com/office/word/2020/wordml/sdtdatahash" xmlns:w16sdtfl="http://schemas.microsoft.com/office/word/2024/wordml/sdtformatlock" xmlns:w16se="http://schemas.microsoft.com/office/word/2015/wordml/symex" xmlns:wpg="http://schemas.microsoft.com/office/word/2010/wordprocessingGroup" xmlns:wpi="http://schemas.microsoft.com/office/word/2010/wordprocessingInk" xmlns:wne="http://schemas.microsoft.com/office/word/2006/wordml" xmlns:wps="http://schemas.microsoft.com/office/word/2010/wordprocessingShape" mc:Ignorable="w14 w15 w16se w16cid w16 w16cex w16sdtdh w16sdtfl w16du wp14">
+<w:hdr xmlns:wpc="http://schemas.microsoft.com/office/word/2010/wordprocessingCanvas" xmlns:cx="http://schemas.microsoft.com/office/drawing/2014/chartex" xmlns:mc="http://schemas.openxmlformats.org/markup-compatibility/2006" xmlns:o="urn:schemas-microsoft-com:office:office" xmlns:r="http://schemas.openxmlformats.org/officeDocument/2006/relationships" xmlns:m="http://schemas.openxmlformats.org/officeDocument/2006/math" xmlns:v="urn:schemas-microsoft-com:vml" xmlns:wp14="http://schemas.microsoft.com/office/word/2010/wordprocessingDrawing" xmlns:wp="http://schemas.openxmlformats.org/drawingml/2006/wordprocessingDrawing" xmlns:w10="urn:schemas-microsoft-com:office:word" xmlns:w="http://schemas.openxmlformats.org/wordprocessingml/2006/main" xmlns:w14="http://schemas.microsoft.com/office/word/2010/wordml" xmlns:w15="http://schemas.microsoft.com/office/word/2012/wordml" xmlns:w16se="http://schemas.microsoft.com/office/word/2015/wordml/symex" xmlns:wpg="http://schemas.microsoft.com/office/word/2010/wordprocessingGroup" xmlns:wpi="http://schemas.microsoft.com/office/word/2010/wordprocessingInk" xmlns:wne="http://schemas.microsoft.com/office/word/2006/wordml" xmlns:wps="http://schemas.microsoft.com/office/word/2010/wordprocessingShape" mc:Ignorable="w14 w15 w16se wp14">
   <w:tbl>
     <w:tblPr>
       <w:tblStyle w:val="Tablaconcuadrcula"/>
@@ -1664,7 +2462,7 @@
               <w:noProof/>
               <w:sz w:val="30"/>
               <w:szCs w:val="30"/>
-              <w:lang w:eastAsia="es-CL"/>
+              <w:lang w:val="en-US"/>
             </w:rPr>
             <w:drawing>
               <wp:inline distT="0" distB="0" distL="0" distR="0" wp14:anchorId="0AF3685A" wp14:editId="619B4EF1">
@@ -1830,7 +2628,7 @@
               <w:noProof/>
               <w:sz w:val="30"/>
               <w:szCs w:val="30"/>
-              <w:lang w:eastAsia="es-CL"/>
+              <w:lang w:val="en-US"/>
             </w:rPr>
             <w:drawing>
               <wp:inline distT="0" distB="0" distL="0" distR="0" wp14:anchorId="36F6F579" wp14:editId="4A26501C">
@@ -1895,7 +2693,7 @@
 </file>
 
 <file path=word/numbering.xml><?xml version="1.0" encoding="utf-8"?>
-<w:numbering xmlns:wpc="http://schemas.microsoft.com/office/word/2010/wordprocessingCanvas" xmlns:cx="http://schemas.microsoft.com/office/drawing/2014/chartex" xmlns:cx1="http://schemas.microsoft.com/office/drawing/2015/9/8/chartex" xmlns:cx2="http://schemas.microsoft.com/office/drawing/2015/10/21/chartex" xmlns:cx3="http://schemas.microsoft.com/office/drawing/2016/5/9/chartex" xmlns:cx4="http://schemas.microsoft.com/office/drawing/2016/5/10/chartex" xmlns:cx5="http://schemas.microsoft.com/office/drawing/2016/5/11/chartex" xmlns:cx6="http://schemas.microsoft.com/office/drawing/2016/5/12/chartex" xmlns:cx7="http://schemas.microsoft.com/office/drawing/2016/5/13/chartex" xmlns:cx8="http://schemas.microsoft.com/office/drawing/2016/5/14/chartex" xmlns:mc="http://schemas.openxmlformats.org/markup-compatibility/2006" xmlns:aink="http://schemas.microsoft.com/office/drawing/2016/ink" xmlns:am3d="http://schemas.microsoft.com/office/drawing/2017/model3d" xmlns:o="urn:schemas-microsoft-com:office:office" xmlns:oel="http://schemas.microsoft.com/office/2019/extlst" xmlns:r="http://schemas.openxmlformats.org/officeDocument/2006/relationships" xmlns:m="http://schemas.openxmlformats.org/officeDocument/2006/math" xmlns:v="urn:schemas-microsoft-com:vml" xmlns:wp14="http://schemas.microsoft.com/office/word/2010/wordprocessingDrawing" xmlns:wp="http://schemas.openxmlformats.org/drawingml/2006/wordprocessingDrawing" xmlns:w10="urn:schemas-microsoft-com:office:word" xmlns:w="http://schemas.openxmlformats.org/wordprocessingml/2006/main" xmlns:w14="http://schemas.microsoft.com/office/word/2010/wordml" xmlns:w15="http://schemas.microsoft.com/office/word/2012/wordml" xmlns:w16cex="http://schemas.microsoft.com/office/word/2018/wordml/cex" xmlns:w16cid="http://schemas.microsoft.com/office/word/2016/wordml/cid" xmlns:w16="http://schemas.microsoft.com/office/word/2018/wordml" xmlns:w16du="http://schemas.microsoft.com/office/word/2023/wordml/word16du" xmlns:w16sdtdh="http://schemas.microsoft.com/office/word/2020/wordml/sdtdatahash" xmlns:w16sdtfl="http://schemas.microsoft.com/office/word/2024/wordml/sdtformatlock" xmlns:w16se="http://schemas.microsoft.com/office/word/2015/wordml/symex" xmlns:wpg="http://schemas.microsoft.com/office/word/2010/wordprocessingGroup" xmlns:wpi="http://schemas.microsoft.com/office/word/2010/wordprocessingInk" xmlns:wne="http://schemas.microsoft.com/office/word/2006/wordml" xmlns:wps="http://schemas.microsoft.com/office/word/2010/wordprocessingShape" mc:Ignorable="w14 w15 w16se w16cid w16 w16cex w16sdtdh w16sdtfl w16du wp14">
+<w:numbering xmlns:wpc="http://schemas.microsoft.com/office/word/2010/wordprocessingCanvas" xmlns:cx="http://schemas.microsoft.com/office/drawing/2014/chartex" xmlns:mc="http://schemas.openxmlformats.org/markup-compatibility/2006" xmlns:o="urn:schemas-microsoft-com:office:office" xmlns:r="http://schemas.openxmlformats.org/officeDocument/2006/relationships" xmlns:m="http://schemas.openxmlformats.org/officeDocument/2006/math" xmlns:v="urn:schemas-microsoft-com:vml" xmlns:wp14="http://schemas.microsoft.com/office/word/2010/wordprocessingDrawing" xmlns:wp="http://schemas.openxmlformats.org/drawingml/2006/wordprocessingDrawing" xmlns:w10="urn:schemas-microsoft-com:office:word" xmlns:w="http://schemas.openxmlformats.org/wordprocessingml/2006/main" xmlns:w14="http://schemas.microsoft.com/office/word/2010/wordml" xmlns:w15="http://schemas.microsoft.com/office/word/2012/wordml" xmlns:w16se="http://schemas.microsoft.com/office/word/2015/wordml/symex" xmlns:wpg="http://schemas.microsoft.com/office/word/2010/wordprocessingGroup" xmlns:wpi="http://schemas.microsoft.com/office/word/2010/wordprocessingInk" xmlns:wne="http://schemas.microsoft.com/office/word/2006/wordml" xmlns:wps="http://schemas.microsoft.com/office/word/2010/wordprocessingShape" mc:Ignorable="w14 w15 w16se wp14">
   <w:abstractNum w:abstractNumId="0" w15:restartNumberingAfterBreak="0">
     <w:nsid w:val="049156A1"/>
     <w:multiLevelType w:val="hybridMultilevel"/>
@@ -3547,6 +4345,119 @@
     </w:lvl>
   </w:abstractNum>
   <w:abstractNum w:abstractNumId="15" w15:restartNumberingAfterBreak="0">
+    <w:nsid w:val="2E9B3CF5"/>
+    <w:multiLevelType w:val="hybridMultilevel"/>
+    <w:tmpl w:val="7A661DCC"/>
+    <w:lvl w:ilvl="0" w:tplc="04090001">
+      <w:start w:val="1"/>
+      <w:numFmt w:val="bullet"/>
+      <w:lvlText w:val=""/>
+      <w:lvlJc w:val="left"/>
+      <w:pPr>
+        <w:ind w:left="720" w:hanging="360"/>
+      </w:pPr>
+      <w:rPr>
+        <w:rFonts w:ascii="Symbol" w:hAnsi="Symbol" w:hint="default"/>
+      </w:rPr>
+    </w:lvl>
+    <w:lvl w:ilvl="1" w:tplc="04090003" w:tentative="1">
+      <w:start w:val="1"/>
+      <w:numFmt w:val="bullet"/>
+      <w:lvlText w:val="o"/>
+      <w:lvlJc w:val="left"/>
+      <w:pPr>
+        <w:ind w:left="1440" w:hanging="360"/>
+      </w:pPr>
+      <w:rPr>
+        <w:rFonts w:ascii="Courier New" w:hAnsi="Courier New" w:cs="Courier New" w:hint="default"/>
+      </w:rPr>
+    </w:lvl>
+    <w:lvl w:ilvl="2" w:tplc="04090005" w:tentative="1">
+      <w:start w:val="1"/>
+      <w:numFmt w:val="bullet"/>
+      <w:lvlText w:val=""/>
+      <w:lvlJc w:val="left"/>
+      <w:pPr>
+        <w:ind w:left="2160" w:hanging="360"/>
+      </w:pPr>
+      <w:rPr>
+        <w:rFonts w:ascii="Wingdings" w:hAnsi="Wingdings" w:hint="default"/>
+      </w:rPr>
+    </w:lvl>
+    <w:lvl w:ilvl="3" w:tplc="04090001" w:tentative="1">
+      <w:start w:val="1"/>
+      <w:numFmt w:val="bullet"/>
+      <w:lvlText w:val=""/>
+      <w:lvlJc w:val="left"/>
+      <w:pPr>
+        <w:ind w:left="2880" w:hanging="360"/>
+      </w:pPr>
+      <w:rPr>
+        <w:rFonts w:ascii="Symbol" w:hAnsi="Symbol" w:hint="default"/>
+      </w:rPr>
+    </w:lvl>
+    <w:lvl w:ilvl="4" w:tplc="04090003" w:tentative="1">
+      <w:start w:val="1"/>
+      <w:numFmt w:val="bullet"/>
+      <w:lvlText w:val="o"/>
+      <w:lvlJc w:val="left"/>
+      <w:pPr>
+        <w:ind w:left="3600" w:hanging="360"/>
+      </w:pPr>
+      <w:rPr>
+        <w:rFonts w:ascii="Courier New" w:hAnsi="Courier New" w:cs="Courier New" w:hint="default"/>
+      </w:rPr>
+    </w:lvl>
+    <w:lvl w:ilvl="5" w:tplc="04090005" w:tentative="1">
+      <w:start w:val="1"/>
+      <w:numFmt w:val="bullet"/>
+      <w:lvlText w:val=""/>
+      <w:lvlJc w:val="left"/>
+      <w:pPr>
+        <w:ind w:left="4320" w:hanging="360"/>
+      </w:pPr>
+      <w:rPr>
+        <w:rFonts w:ascii="Wingdings" w:hAnsi="Wingdings" w:hint="default"/>
+      </w:rPr>
+    </w:lvl>
+    <w:lvl w:ilvl="6" w:tplc="04090001" w:tentative="1">
+      <w:start w:val="1"/>
+      <w:numFmt w:val="bullet"/>
+      <w:lvlText w:val=""/>
+      <w:lvlJc w:val="left"/>
+      <w:pPr>
+        <w:ind w:left="5040" w:hanging="360"/>
+      </w:pPr>
+      <w:rPr>
+        <w:rFonts w:ascii="Symbol" w:hAnsi="Symbol" w:hint="default"/>
+      </w:rPr>
+    </w:lvl>
+    <w:lvl w:ilvl="7" w:tplc="04090003" w:tentative="1">
+      <w:start w:val="1"/>
+      <w:numFmt w:val="bullet"/>
+      <w:lvlText w:val="o"/>
+      <w:lvlJc w:val="left"/>
+      <w:pPr>
+        <w:ind w:left="5760" w:hanging="360"/>
+      </w:pPr>
+      <w:rPr>
+        <w:rFonts w:ascii="Courier New" w:hAnsi="Courier New" w:cs="Courier New" w:hint="default"/>
+      </w:rPr>
+    </w:lvl>
+    <w:lvl w:ilvl="8" w:tplc="04090005" w:tentative="1">
+      <w:start w:val="1"/>
+      <w:numFmt w:val="bullet"/>
+      <w:lvlText w:val=""/>
+      <w:lvlJc w:val="left"/>
+      <w:pPr>
+        <w:ind w:left="6480" w:hanging="360"/>
+      </w:pPr>
+      <w:rPr>
+        <w:rFonts w:ascii="Wingdings" w:hAnsi="Wingdings" w:hint="default"/>
+      </w:rPr>
+    </w:lvl>
+  </w:abstractNum>
+  <w:abstractNum w:abstractNumId="16" w15:restartNumberingAfterBreak="0">
     <w:nsid w:val="2FFD4C7F"/>
     <w:multiLevelType w:val="multilevel"/>
     <w:tmpl w:val="CAF0F936"/>
@@ -3667,7 +4578,7 @@
       </w:rPr>
     </w:lvl>
   </w:abstractNum>
-  <w:abstractNum w:abstractNumId="16" w15:restartNumberingAfterBreak="0">
+  <w:abstractNum w:abstractNumId="17" w15:restartNumberingAfterBreak="0">
     <w:nsid w:val="34CF2F87"/>
     <w:multiLevelType w:val="hybridMultilevel"/>
     <w:tmpl w:val="118C685A"/>
@@ -3780,7 +4691,7 @@
       </w:rPr>
     </w:lvl>
   </w:abstractNum>
-  <w:abstractNum w:abstractNumId="17" w15:restartNumberingAfterBreak="0">
+  <w:abstractNum w:abstractNumId="18" w15:restartNumberingAfterBreak="0">
     <w:nsid w:val="38357D52"/>
     <w:multiLevelType w:val="hybridMultilevel"/>
     <w:tmpl w:val="FEC43D04"/>
@@ -3866,7 +4777,7 @@
       </w:pPr>
     </w:lvl>
   </w:abstractNum>
-  <w:abstractNum w:abstractNumId="18" w15:restartNumberingAfterBreak="0">
+  <w:abstractNum w:abstractNumId="19" w15:restartNumberingAfterBreak="0">
     <w:nsid w:val="3B2D7969"/>
     <w:multiLevelType w:val="hybridMultilevel"/>
     <w:tmpl w:val="E232559C"/>
@@ -3979,7 +4890,7 @@
       </w:rPr>
     </w:lvl>
   </w:abstractNum>
-  <w:abstractNum w:abstractNumId="19" w15:restartNumberingAfterBreak="0">
+  <w:abstractNum w:abstractNumId="20" w15:restartNumberingAfterBreak="0">
     <w:nsid w:val="3BA86CEA"/>
     <w:multiLevelType w:val="hybridMultilevel"/>
     <w:tmpl w:val="9FE6ED10"/>
@@ -4092,7 +5003,7 @@
       </w:rPr>
     </w:lvl>
   </w:abstractNum>
-  <w:abstractNum w:abstractNumId="20" w15:restartNumberingAfterBreak="0">
+  <w:abstractNum w:abstractNumId="21" w15:restartNumberingAfterBreak="0">
     <w:nsid w:val="3F0F587D"/>
     <w:multiLevelType w:val="hybridMultilevel"/>
     <w:tmpl w:val="D99019EE"/>
@@ -4205,7 +5116,120 @@
       </w:rPr>
     </w:lvl>
   </w:abstractNum>
-  <w:abstractNum w:abstractNumId="21" w15:restartNumberingAfterBreak="0">
+  <w:abstractNum w:abstractNumId="22" w15:restartNumberingAfterBreak="0">
+    <w:nsid w:val="3FB42AD9"/>
+    <w:multiLevelType w:val="hybridMultilevel"/>
+    <w:tmpl w:val="EAFE95A0"/>
+    <w:lvl w:ilvl="0" w:tplc="04090001">
+      <w:start w:val="1"/>
+      <w:numFmt w:val="bullet"/>
+      <w:lvlText w:val=""/>
+      <w:lvlJc w:val="left"/>
+      <w:pPr>
+        <w:ind w:left="720" w:hanging="360"/>
+      </w:pPr>
+      <w:rPr>
+        <w:rFonts w:ascii="Symbol" w:hAnsi="Symbol" w:hint="default"/>
+      </w:rPr>
+    </w:lvl>
+    <w:lvl w:ilvl="1" w:tplc="04090003" w:tentative="1">
+      <w:start w:val="1"/>
+      <w:numFmt w:val="bullet"/>
+      <w:lvlText w:val="o"/>
+      <w:lvlJc w:val="left"/>
+      <w:pPr>
+        <w:ind w:left="1440" w:hanging="360"/>
+      </w:pPr>
+      <w:rPr>
+        <w:rFonts w:ascii="Courier New" w:hAnsi="Courier New" w:cs="Courier New" w:hint="default"/>
+      </w:rPr>
+    </w:lvl>
+    <w:lvl w:ilvl="2" w:tplc="04090005" w:tentative="1">
+      <w:start w:val="1"/>
+      <w:numFmt w:val="bullet"/>
+      <w:lvlText w:val=""/>
+      <w:lvlJc w:val="left"/>
+      <w:pPr>
+        <w:ind w:left="2160" w:hanging="360"/>
+      </w:pPr>
+      <w:rPr>
+        <w:rFonts w:ascii="Wingdings" w:hAnsi="Wingdings" w:hint="default"/>
+      </w:rPr>
+    </w:lvl>
+    <w:lvl w:ilvl="3" w:tplc="04090001" w:tentative="1">
+      <w:start w:val="1"/>
+      <w:numFmt w:val="bullet"/>
+      <w:lvlText w:val=""/>
+      <w:lvlJc w:val="left"/>
+      <w:pPr>
+        <w:ind w:left="2880" w:hanging="360"/>
+      </w:pPr>
+      <w:rPr>
+        <w:rFonts w:ascii="Symbol" w:hAnsi="Symbol" w:hint="default"/>
+      </w:rPr>
+    </w:lvl>
+    <w:lvl w:ilvl="4" w:tplc="04090003" w:tentative="1">
+      <w:start w:val="1"/>
+      <w:numFmt w:val="bullet"/>
+      <w:lvlText w:val="o"/>
+      <w:lvlJc w:val="left"/>
+      <w:pPr>
+        <w:ind w:left="3600" w:hanging="360"/>
+      </w:pPr>
+      <w:rPr>
+        <w:rFonts w:ascii="Courier New" w:hAnsi="Courier New" w:cs="Courier New" w:hint="default"/>
+      </w:rPr>
+    </w:lvl>
+    <w:lvl w:ilvl="5" w:tplc="04090005" w:tentative="1">
+      <w:start w:val="1"/>
+      <w:numFmt w:val="bullet"/>
+      <w:lvlText w:val=""/>
+      <w:lvlJc w:val="left"/>
+      <w:pPr>
+        <w:ind w:left="4320" w:hanging="360"/>
+      </w:pPr>
+      <w:rPr>
+        <w:rFonts w:ascii="Wingdings" w:hAnsi="Wingdings" w:hint="default"/>
+      </w:rPr>
+    </w:lvl>
+    <w:lvl w:ilvl="6" w:tplc="04090001" w:tentative="1">
+      <w:start w:val="1"/>
+      <w:numFmt w:val="bullet"/>
+      <w:lvlText w:val=""/>
+      <w:lvlJc w:val="left"/>
+      <w:pPr>
+        <w:ind w:left="5040" w:hanging="360"/>
+      </w:pPr>
+      <w:rPr>
+        <w:rFonts w:ascii="Symbol" w:hAnsi="Symbol" w:hint="default"/>
+      </w:rPr>
+    </w:lvl>
+    <w:lvl w:ilvl="7" w:tplc="04090003" w:tentative="1">
+      <w:start w:val="1"/>
+      <w:numFmt w:val="bullet"/>
+      <w:lvlText w:val="o"/>
+      <w:lvlJc w:val="left"/>
+      <w:pPr>
+        <w:ind w:left="5760" w:hanging="360"/>
+      </w:pPr>
+      <w:rPr>
+        <w:rFonts w:ascii="Courier New" w:hAnsi="Courier New" w:cs="Courier New" w:hint="default"/>
+      </w:rPr>
+    </w:lvl>
+    <w:lvl w:ilvl="8" w:tplc="04090005" w:tentative="1">
+      <w:start w:val="1"/>
+      <w:numFmt w:val="bullet"/>
+      <w:lvlText w:val=""/>
+      <w:lvlJc w:val="left"/>
+      <w:pPr>
+        <w:ind w:left="6480" w:hanging="360"/>
+      </w:pPr>
+      <w:rPr>
+        <w:rFonts w:ascii="Wingdings" w:hAnsi="Wingdings" w:hint="default"/>
+      </w:rPr>
+    </w:lvl>
+  </w:abstractNum>
+  <w:abstractNum w:abstractNumId="23" w15:restartNumberingAfterBreak="0">
     <w:nsid w:val="44F11BDD"/>
     <w:multiLevelType w:val="hybridMultilevel"/>
     <w:tmpl w:val="3F5AF554"/>
@@ -4318,7 +5342,120 @@
       </w:rPr>
     </w:lvl>
   </w:abstractNum>
-  <w:abstractNum w:abstractNumId="22" w15:restartNumberingAfterBreak="0">
+  <w:abstractNum w:abstractNumId="24" w15:restartNumberingAfterBreak="0">
+    <w:nsid w:val="4B262391"/>
+    <w:multiLevelType w:val="hybridMultilevel"/>
+    <w:tmpl w:val="432422C6"/>
+    <w:lvl w:ilvl="0" w:tplc="04090001">
+      <w:start w:val="1"/>
+      <w:numFmt w:val="bullet"/>
+      <w:lvlText w:val=""/>
+      <w:lvlJc w:val="left"/>
+      <w:pPr>
+        <w:ind w:left="720" w:hanging="360"/>
+      </w:pPr>
+      <w:rPr>
+        <w:rFonts w:ascii="Symbol" w:hAnsi="Symbol" w:hint="default"/>
+      </w:rPr>
+    </w:lvl>
+    <w:lvl w:ilvl="1" w:tplc="04090003" w:tentative="1">
+      <w:start w:val="1"/>
+      <w:numFmt w:val="bullet"/>
+      <w:lvlText w:val="o"/>
+      <w:lvlJc w:val="left"/>
+      <w:pPr>
+        <w:ind w:left="1440" w:hanging="360"/>
+      </w:pPr>
+      <w:rPr>
+        <w:rFonts w:ascii="Courier New" w:hAnsi="Courier New" w:cs="Courier New" w:hint="default"/>
+      </w:rPr>
+    </w:lvl>
+    <w:lvl w:ilvl="2" w:tplc="04090005" w:tentative="1">
+      <w:start w:val="1"/>
+      <w:numFmt w:val="bullet"/>
+      <w:lvlText w:val=""/>
+      <w:lvlJc w:val="left"/>
+      <w:pPr>
+        <w:ind w:left="2160" w:hanging="360"/>
+      </w:pPr>
+      <w:rPr>
+        <w:rFonts w:ascii="Wingdings" w:hAnsi="Wingdings" w:hint="default"/>
+      </w:rPr>
+    </w:lvl>
+    <w:lvl w:ilvl="3" w:tplc="04090001" w:tentative="1">
+      <w:start w:val="1"/>
+      <w:numFmt w:val="bullet"/>
+      <w:lvlText w:val=""/>
+      <w:lvlJc w:val="left"/>
+      <w:pPr>
+        <w:ind w:left="2880" w:hanging="360"/>
+      </w:pPr>
+      <w:rPr>
+        <w:rFonts w:ascii="Symbol" w:hAnsi="Symbol" w:hint="default"/>
+      </w:rPr>
+    </w:lvl>
+    <w:lvl w:ilvl="4" w:tplc="04090003" w:tentative="1">
+      <w:start w:val="1"/>
+      <w:numFmt w:val="bullet"/>
+      <w:lvlText w:val="o"/>
+      <w:lvlJc w:val="left"/>
+      <w:pPr>
+        <w:ind w:left="3600" w:hanging="360"/>
+      </w:pPr>
+      <w:rPr>
+        <w:rFonts w:ascii="Courier New" w:hAnsi="Courier New" w:cs="Courier New" w:hint="default"/>
+      </w:rPr>
+    </w:lvl>
+    <w:lvl w:ilvl="5" w:tplc="04090005" w:tentative="1">
+      <w:start w:val="1"/>
+      <w:numFmt w:val="bullet"/>
+      <w:lvlText w:val=""/>
+      <w:lvlJc w:val="left"/>
+      <w:pPr>
+        <w:ind w:left="4320" w:hanging="360"/>
+      </w:pPr>
+      <w:rPr>
+        <w:rFonts w:ascii="Wingdings" w:hAnsi="Wingdings" w:hint="default"/>
+      </w:rPr>
+    </w:lvl>
+    <w:lvl w:ilvl="6" w:tplc="04090001" w:tentative="1">
+      <w:start w:val="1"/>
+      <w:numFmt w:val="bullet"/>
+      <w:lvlText w:val=""/>
+      <w:lvlJc w:val="left"/>
+      <w:pPr>
+        <w:ind w:left="5040" w:hanging="360"/>
+      </w:pPr>
+      <w:rPr>
+        <w:rFonts w:ascii="Symbol" w:hAnsi="Symbol" w:hint="default"/>
+      </w:rPr>
+    </w:lvl>
+    <w:lvl w:ilvl="7" w:tplc="04090003" w:tentative="1">
+      <w:start w:val="1"/>
+      <w:numFmt w:val="bullet"/>
+      <w:lvlText w:val="o"/>
+      <w:lvlJc w:val="left"/>
+      <w:pPr>
+        <w:ind w:left="5760" w:hanging="360"/>
+      </w:pPr>
+      <w:rPr>
+        <w:rFonts w:ascii="Courier New" w:hAnsi="Courier New" w:cs="Courier New" w:hint="default"/>
+      </w:rPr>
+    </w:lvl>
+    <w:lvl w:ilvl="8" w:tplc="04090005" w:tentative="1">
+      <w:start w:val="1"/>
+      <w:numFmt w:val="bullet"/>
+      <w:lvlText w:val=""/>
+      <w:lvlJc w:val="left"/>
+      <w:pPr>
+        <w:ind w:left="6480" w:hanging="360"/>
+      </w:pPr>
+      <w:rPr>
+        <w:rFonts w:ascii="Wingdings" w:hAnsi="Wingdings" w:hint="default"/>
+      </w:rPr>
+    </w:lvl>
+  </w:abstractNum>
+  <w:abstractNum w:abstractNumId="25" w15:restartNumberingAfterBreak="0">
     <w:nsid w:val="4FE12D10"/>
     <w:multiLevelType w:val="hybridMultilevel"/>
     <w:tmpl w:val="1550181C"/>
@@ -4431,7 +5568,7 @@
       </w:rPr>
     </w:lvl>
   </w:abstractNum>
-  <w:abstractNum w:abstractNumId="23" w15:restartNumberingAfterBreak="0">
+  <w:abstractNum w:abstractNumId="26" w15:restartNumberingAfterBreak="0">
     <w:nsid w:val="50C131BC"/>
     <w:multiLevelType w:val="hybridMultilevel"/>
     <w:tmpl w:val="8FDC567E"/>
@@ -4544,7 +5681,7 @@
       </w:rPr>
     </w:lvl>
   </w:abstractNum>
-  <w:abstractNum w:abstractNumId="24" w15:restartNumberingAfterBreak="0">
+  <w:abstractNum w:abstractNumId="27" w15:restartNumberingAfterBreak="0">
     <w:nsid w:val="510E5C01"/>
     <w:multiLevelType w:val="multilevel"/>
     <w:tmpl w:val="BC9C1F48"/>
@@ -4657,7 +5794,7 @@
       </w:rPr>
     </w:lvl>
   </w:abstractNum>
-  <w:abstractNum w:abstractNumId="25" w15:restartNumberingAfterBreak="0">
+  <w:abstractNum w:abstractNumId="28" w15:restartNumberingAfterBreak="0">
     <w:nsid w:val="5C463542"/>
     <w:multiLevelType w:val="multilevel"/>
     <w:tmpl w:val="C3E4949E"/>
@@ -4806,7 +5943,7 @@
       </w:rPr>
     </w:lvl>
   </w:abstractNum>
-  <w:abstractNum w:abstractNumId="26" w15:restartNumberingAfterBreak="0">
+  <w:abstractNum w:abstractNumId="29" w15:restartNumberingAfterBreak="0">
     <w:nsid w:val="64E91BB3"/>
     <w:multiLevelType w:val="multilevel"/>
     <w:tmpl w:val="A672F762"/>
@@ -4955,7 +6092,7 @@
       </w:rPr>
     </w:lvl>
   </w:abstractNum>
-  <w:abstractNum w:abstractNumId="27" w15:restartNumberingAfterBreak="0">
+  <w:abstractNum w:abstractNumId="30" w15:restartNumberingAfterBreak="0">
     <w:nsid w:val="696808F7"/>
     <w:multiLevelType w:val="multilevel"/>
     <w:tmpl w:val="2536CC4E"/>
@@ -5104,7 +6241,7 @@
       </w:rPr>
     </w:lvl>
   </w:abstractNum>
-  <w:abstractNum w:abstractNumId="28" w15:restartNumberingAfterBreak="0">
+  <w:abstractNum w:abstractNumId="31" w15:restartNumberingAfterBreak="0">
     <w:nsid w:val="6ADA0051"/>
     <w:multiLevelType w:val="multilevel"/>
     <w:tmpl w:val="C806233A"/>
@@ -5253,7 +6390,7 @@
       </w:rPr>
     </w:lvl>
   </w:abstractNum>
-  <w:abstractNum w:abstractNumId="29" w15:restartNumberingAfterBreak="0">
+  <w:abstractNum w:abstractNumId="32" w15:restartNumberingAfterBreak="0">
     <w:nsid w:val="6BDB0362"/>
     <w:multiLevelType w:val="hybridMultilevel"/>
     <w:tmpl w:val="8106327E"/>
@@ -5342,7 +6479,7 @@
       </w:pPr>
     </w:lvl>
   </w:abstractNum>
-  <w:abstractNum w:abstractNumId="30" w15:restartNumberingAfterBreak="0">
+  <w:abstractNum w:abstractNumId="33" w15:restartNumberingAfterBreak="0">
     <w:nsid w:val="6C6F3F57"/>
     <w:multiLevelType w:val="multilevel"/>
     <w:tmpl w:val="7AAC7692"/>
@@ -5491,7 +6628,7 @@
       </w:rPr>
     </w:lvl>
   </w:abstractNum>
-  <w:abstractNum w:abstractNumId="31" w15:restartNumberingAfterBreak="0">
+  <w:abstractNum w:abstractNumId="34" w15:restartNumberingAfterBreak="0">
     <w:nsid w:val="6F3C13F9"/>
     <w:multiLevelType w:val="hybridMultilevel"/>
     <w:tmpl w:val="B40CE148"/>
@@ -5604,7 +6741,7 @@
       </w:rPr>
     </w:lvl>
   </w:abstractNum>
-  <w:abstractNum w:abstractNumId="32" w15:restartNumberingAfterBreak="0">
+  <w:abstractNum w:abstractNumId="35" w15:restartNumberingAfterBreak="0">
     <w:nsid w:val="6F5F64B1"/>
     <w:multiLevelType w:val="hybridMultilevel"/>
     <w:tmpl w:val="999C60C0"/>
@@ -5693,7 +6830,7 @@
       </w:pPr>
     </w:lvl>
   </w:abstractNum>
-  <w:abstractNum w:abstractNumId="33" w15:restartNumberingAfterBreak="0">
+  <w:abstractNum w:abstractNumId="36" w15:restartNumberingAfterBreak="0">
     <w:nsid w:val="731E1176"/>
     <w:multiLevelType w:val="hybridMultilevel"/>
     <w:tmpl w:val="5846EECC"/>
@@ -5782,7 +6919,7 @@
       </w:pPr>
     </w:lvl>
   </w:abstractNum>
-  <w:abstractNum w:abstractNumId="34" w15:restartNumberingAfterBreak="0">
+  <w:abstractNum w:abstractNumId="37" w15:restartNumberingAfterBreak="0">
     <w:nsid w:val="74565F7A"/>
     <w:multiLevelType w:val="multilevel"/>
     <w:tmpl w:val="36B8B0EE"/>
@@ -5931,7 +7068,7 @@
       </w:rPr>
     </w:lvl>
   </w:abstractNum>
-  <w:abstractNum w:abstractNumId="35" w15:restartNumberingAfterBreak="0">
+  <w:abstractNum w:abstractNumId="38" w15:restartNumberingAfterBreak="0">
     <w:nsid w:val="74F525A0"/>
     <w:multiLevelType w:val="hybridMultilevel"/>
     <w:tmpl w:val="6E2889E8"/>
@@ -6044,7 +7181,7 @@
       </w:rPr>
     </w:lvl>
   </w:abstractNum>
-  <w:abstractNum w:abstractNumId="36" w15:restartNumberingAfterBreak="0">
+  <w:abstractNum w:abstractNumId="39" w15:restartNumberingAfterBreak="0">
     <w:nsid w:val="78261542"/>
     <w:multiLevelType w:val="hybridMultilevel"/>
     <w:tmpl w:val="93C21CAE"/>
@@ -6157,7 +7294,7 @@
       </w:rPr>
     </w:lvl>
   </w:abstractNum>
-  <w:abstractNum w:abstractNumId="37" w15:restartNumberingAfterBreak="0">
+  <w:abstractNum w:abstractNumId="40" w15:restartNumberingAfterBreak="0">
     <w:nsid w:val="7A044B22"/>
     <w:multiLevelType w:val="hybridMultilevel"/>
     <w:tmpl w:val="5D9A3082"/>
@@ -6270,7 +7407,7 @@
       </w:rPr>
     </w:lvl>
   </w:abstractNum>
-  <w:abstractNum w:abstractNumId="38" w15:restartNumberingAfterBreak="0">
+  <w:abstractNum w:abstractNumId="41" w15:restartNumberingAfterBreak="0">
     <w:nsid w:val="7AB36760"/>
     <w:multiLevelType w:val="hybridMultilevel"/>
     <w:tmpl w:val="2A60134C"/>
@@ -6356,7 +7493,7 @@
       </w:pPr>
     </w:lvl>
   </w:abstractNum>
-  <w:abstractNum w:abstractNumId="39" w15:restartNumberingAfterBreak="0">
+  <w:abstractNum w:abstractNumId="42" w15:restartNumberingAfterBreak="0">
     <w:nsid w:val="7B9B44FE"/>
     <w:multiLevelType w:val="multilevel"/>
     <w:tmpl w:val="06565EEA"/>
@@ -6505,7 +7642,7 @@
       </w:rPr>
     </w:lvl>
   </w:abstractNum>
-  <w:abstractNum w:abstractNumId="40" w15:restartNumberingAfterBreak="0">
+  <w:abstractNum w:abstractNumId="43" w15:restartNumberingAfterBreak="0">
     <w:nsid w:val="7DBB548A"/>
     <w:multiLevelType w:val="multilevel"/>
     <w:tmpl w:val="D5CA36FE"/>
@@ -6654,7 +7791,7 @@
       </w:rPr>
     </w:lvl>
   </w:abstractNum>
-  <w:abstractNum w:abstractNumId="41" w15:restartNumberingAfterBreak="0">
+  <w:abstractNum w:abstractNumId="44" w15:restartNumberingAfterBreak="0">
     <w:nsid w:val="7F291C01"/>
     <w:multiLevelType w:val="hybridMultilevel"/>
     <w:tmpl w:val="19B0EB20"/>
@@ -6767,138 +7904,147 @@
       </w:rPr>
     </w:lvl>
   </w:abstractNum>
-  <w:num w:numId="1" w16cid:durableId="1452826369">
+  <w:num w:numId="1">
     <w:abstractNumId w:val="3"/>
   </w:num>
-  <w:num w:numId="2" w16cid:durableId="288443028">
+  <w:num w:numId="2">
     <w:abstractNumId w:val="8"/>
   </w:num>
-  <w:num w:numId="3" w16cid:durableId="816843403">
+  <w:num w:numId="3">
     <w:abstractNumId w:val="12"/>
   </w:num>
-  <w:num w:numId="4" w16cid:durableId="1486044521">
+  <w:num w:numId="4">
+    <w:abstractNumId w:val="32"/>
+  </w:num>
+  <w:num w:numId="5">
+    <w:abstractNumId w:val="35"/>
+  </w:num>
+  <w:num w:numId="6">
+    <w:abstractNumId w:val="4"/>
+  </w:num>
+  <w:num w:numId="7">
+    <w:abstractNumId w:val="11"/>
+  </w:num>
+  <w:num w:numId="8">
+    <w:abstractNumId w:val="20"/>
+  </w:num>
+  <w:num w:numId="9">
+    <w:abstractNumId w:val="16"/>
+  </w:num>
+  <w:num w:numId="10">
+    <w:abstractNumId w:val="9"/>
+  </w:num>
+  <w:num w:numId="11">
+    <w:abstractNumId w:val="27"/>
+  </w:num>
+  <w:num w:numId="12">
+    <w:abstractNumId w:val="40"/>
+  </w:num>
+  <w:num w:numId="13">
+    <w:abstractNumId w:val="34"/>
+  </w:num>
+  <w:num w:numId="14">
+    <w:abstractNumId w:val="1"/>
+  </w:num>
+  <w:num w:numId="15">
+    <w:abstractNumId w:val="41"/>
+  </w:num>
+  <w:num w:numId="16">
+    <w:abstractNumId w:val="23"/>
+  </w:num>
+  <w:num w:numId="17">
+    <w:abstractNumId w:val="18"/>
+  </w:num>
+  <w:num w:numId="18">
+    <w:abstractNumId w:val="36"/>
+  </w:num>
+  <w:num w:numId="19">
+    <w:abstractNumId w:val="10"/>
+  </w:num>
+  <w:num w:numId="20">
+    <w:abstractNumId w:val="44"/>
+  </w:num>
+  <w:num w:numId="21">
+    <w:abstractNumId w:val="39"/>
+  </w:num>
+  <w:num w:numId="22">
+    <w:abstractNumId w:val="13"/>
+  </w:num>
+  <w:num w:numId="23">
+    <w:abstractNumId w:val="14"/>
+  </w:num>
+  <w:num w:numId="24">
+    <w:abstractNumId w:val="5"/>
+  </w:num>
+  <w:num w:numId="25">
+    <w:abstractNumId w:val="17"/>
+  </w:num>
+  <w:num w:numId="26">
+    <w:abstractNumId w:val="21"/>
+  </w:num>
+  <w:num w:numId="27">
+    <w:abstractNumId w:val="26"/>
+  </w:num>
+  <w:num w:numId="28">
+    <w:abstractNumId w:val="0"/>
+  </w:num>
+  <w:num w:numId="29">
+    <w:abstractNumId w:val="19"/>
+  </w:num>
+  <w:num w:numId="30">
+    <w:abstractNumId w:val="25"/>
+  </w:num>
+  <w:num w:numId="31">
+    <w:abstractNumId w:val="2"/>
+  </w:num>
+  <w:num w:numId="32">
+    <w:abstractNumId w:val="7"/>
+  </w:num>
+  <w:num w:numId="33">
+    <w:abstractNumId w:val="37"/>
+  </w:num>
+  <w:num w:numId="34">
+    <w:abstractNumId w:val="43"/>
+  </w:num>
+  <w:num w:numId="35">
+    <w:abstractNumId w:val="6"/>
+  </w:num>
+  <w:num w:numId="36">
+    <w:abstractNumId w:val="28"/>
+  </w:num>
+  <w:num w:numId="37">
+    <w:abstractNumId w:val="42"/>
+  </w:num>
+  <w:num w:numId="38">
+    <w:abstractNumId w:val="31"/>
+  </w:num>
+  <w:num w:numId="39">
     <w:abstractNumId w:val="29"/>
   </w:num>
-  <w:num w:numId="5" w16cid:durableId="578827106">
-    <w:abstractNumId w:val="32"/>
+  <w:num w:numId="40">
+    <w:abstractNumId w:val="38"/>
   </w:num>
-  <w:num w:numId="6" w16cid:durableId="438306077">
-    <w:abstractNumId w:val="4"/>
+  <w:num w:numId="41">
+    <w:abstractNumId w:val="30"/>
   </w:num>
-  <w:num w:numId="7" w16cid:durableId="704595986">
-    <w:abstractNumId w:val="11"/>
+  <w:num w:numId="42">
+    <w:abstractNumId w:val="33"/>
   </w:num>
-  <w:num w:numId="8" w16cid:durableId="694696472">
-    <w:abstractNumId w:val="19"/>
-  </w:num>
-  <w:num w:numId="9" w16cid:durableId="169417263">
+  <w:num w:numId="43">
     <w:abstractNumId w:val="15"/>
   </w:num>
-  <w:num w:numId="10" w16cid:durableId="440491821">
-    <w:abstractNumId w:val="9"/>
-  </w:num>
-  <w:num w:numId="11" w16cid:durableId="107235636">
+  <w:num w:numId="44">
     <w:abstractNumId w:val="24"/>
   </w:num>
-  <w:num w:numId="12" w16cid:durableId="761292659">
-    <w:abstractNumId w:val="37"/>
-  </w:num>
-  <w:num w:numId="13" w16cid:durableId="1556352983">
-    <w:abstractNumId w:val="31"/>
-  </w:num>
-  <w:num w:numId="14" w16cid:durableId="1636180202">
-    <w:abstractNumId w:val="1"/>
-  </w:num>
-  <w:num w:numId="15" w16cid:durableId="196937102">
-    <w:abstractNumId w:val="38"/>
-  </w:num>
-  <w:num w:numId="16" w16cid:durableId="677850306">
-    <w:abstractNumId w:val="21"/>
-  </w:num>
-  <w:num w:numId="17" w16cid:durableId="1834442782">
-    <w:abstractNumId w:val="17"/>
-  </w:num>
-  <w:num w:numId="18" w16cid:durableId="541554634">
-    <w:abstractNumId w:val="33"/>
-  </w:num>
-  <w:num w:numId="19" w16cid:durableId="1040396049">
-    <w:abstractNumId w:val="10"/>
-  </w:num>
-  <w:num w:numId="20" w16cid:durableId="167646340">
-    <w:abstractNumId w:val="41"/>
-  </w:num>
-  <w:num w:numId="21" w16cid:durableId="2102602703">
-    <w:abstractNumId w:val="36"/>
-  </w:num>
-  <w:num w:numId="22" w16cid:durableId="304699736">
-    <w:abstractNumId w:val="13"/>
-  </w:num>
-  <w:num w:numId="23" w16cid:durableId="991643177">
-    <w:abstractNumId w:val="14"/>
-  </w:num>
-  <w:num w:numId="24" w16cid:durableId="489294996">
-    <w:abstractNumId w:val="5"/>
-  </w:num>
-  <w:num w:numId="25" w16cid:durableId="1922060757">
-    <w:abstractNumId w:val="16"/>
-  </w:num>
-  <w:num w:numId="26" w16cid:durableId="1814054336">
-    <w:abstractNumId w:val="20"/>
-  </w:num>
-  <w:num w:numId="27" w16cid:durableId="370688855">
-    <w:abstractNumId w:val="23"/>
-  </w:num>
-  <w:num w:numId="28" w16cid:durableId="1020468729">
-    <w:abstractNumId w:val="0"/>
-  </w:num>
-  <w:num w:numId="29" w16cid:durableId="761488503">
-    <w:abstractNumId w:val="18"/>
-  </w:num>
-  <w:num w:numId="30" w16cid:durableId="1087579222">
+  <w:num w:numId="45">
     <w:abstractNumId w:val="22"/>
-  </w:num>
-  <w:num w:numId="31" w16cid:durableId="1853373882">
-    <w:abstractNumId w:val="2"/>
-  </w:num>
-  <w:num w:numId="32" w16cid:durableId="1817064352">
-    <w:abstractNumId w:val="7"/>
-  </w:num>
-  <w:num w:numId="33" w16cid:durableId="1667904091">
-    <w:abstractNumId w:val="34"/>
-  </w:num>
-  <w:num w:numId="34" w16cid:durableId="234828182">
-    <w:abstractNumId w:val="40"/>
-  </w:num>
-  <w:num w:numId="35" w16cid:durableId="868028594">
-    <w:abstractNumId w:val="6"/>
-  </w:num>
-  <w:num w:numId="36" w16cid:durableId="532034197">
-    <w:abstractNumId w:val="25"/>
-  </w:num>
-  <w:num w:numId="37" w16cid:durableId="1858305738">
-    <w:abstractNumId w:val="39"/>
-  </w:num>
-  <w:num w:numId="38" w16cid:durableId="1497694573">
-    <w:abstractNumId w:val="28"/>
-  </w:num>
-  <w:num w:numId="39" w16cid:durableId="1804932283">
-    <w:abstractNumId w:val="26"/>
-  </w:num>
-  <w:num w:numId="40" w16cid:durableId="1869442608">
-    <w:abstractNumId w:val="35"/>
-  </w:num>
-  <w:num w:numId="41" w16cid:durableId="805126968">
-    <w:abstractNumId w:val="27"/>
-  </w:num>
-  <w:num w:numId="42" w16cid:durableId="285821661">
-    <w:abstractNumId w:val="30"/>
   </w:num>
   <w:numIdMacAtCleanup w:val="18"/>
 </w:numbering>
 </file>
 
 <file path=word/styles.xml><?xml version="1.0" encoding="utf-8"?>
-<w:styles xmlns:mc="http://schemas.openxmlformats.org/markup-compatibility/2006" xmlns:r="http://schemas.openxmlformats.org/officeDocument/2006/relationships" xmlns:w="http://schemas.openxmlformats.org/wordprocessingml/2006/main" xmlns:w14="http://schemas.microsoft.com/office/word/2010/wordml" xmlns:w15="http://schemas.microsoft.com/office/word/2012/wordml" xmlns:w16cex="http://schemas.microsoft.com/office/word/2018/wordml/cex" xmlns:w16cid="http://schemas.microsoft.com/office/word/2016/wordml/cid" xmlns:w16="http://schemas.microsoft.com/office/word/2018/wordml" xmlns:w16du="http://schemas.microsoft.com/office/word/2023/wordml/word16du" xmlns:w16sdtdh="http://schemas.microsoft.com/office/word/2020/wordml/sdtdatahash" xmlns:w16sdtfl="http://schemas.microsoft.com/office/word/2024/wordml/sdtformatlock" xmlns:w16se="http://schemas.microsoft.com/office/word/2015/wordml/symex" mc:Ignorable="w14 w15 w16se w16cid w16 w16cex w16sdtdh w16sdtfl w16du">
+<w:styles xmlns:mc="http://schemas.openxmlformats.org/markup-compatibility/2006" xmlns:r="http://schemas.openxmlformats.org/officeDocument/2006/relationships" xmlns:w="http://schemas.openxmlformats.org/wordprocessingml/2006/main" xmlns:w14="http://schemas.microsoft.com/office/word/2010/wordml" xmlns:w15="http://schemas.microsoft.com/office/word/2012/wordml" xmlns:w16se="http://schemas.microsoft.com/office/word/2015/wordml/symex" mc:Ignorable="w14 w15 w16se">
   <w:docDefaults>
     <w:rPrDefault>
       <w:rPr>
@@ -6914,7 +8060,7 @@
       </w:pPr>
     </w:pPrDefault>
   </w:docDefaults>
-  <w:latentStyles w:defLockedState="0" w:defUIPriority="99" w:defSemiHidden="0" w:defUnhideWhenUsed="0" w:defQFormat="0" w:count="376">
+  <w:latentStyles w:defLockedState="0" w:defUIPriority="99" w:defSemiHidden="0" w:defUnhideWhenUsed="0" w:defQFormat="0" w:count="371">
     <w:lsdException w:name="Normal" w:uiPriority="0" w:qFormat="1"/>
     <w:lsdException w:name="heading 1" w:uiPriority="9" w:qFormat="1"/>
     <w:lsdException w:name="heading 2" w:semiHidden="1" w:uiPriority="9" w:unhideWhenUsed="1" w:qFormat="1"/>
@@ -7286,11 +8432,6 @@
     <w:lsdException w:name="List Table 5 Dark Accent 6" w:uiPriority="50"/>
     <w:lsdException w:name="List Table 6 Colorful Accent 6" w:uiPriority="51"/>
     <w:lsdException w:name="List Table 7 Colorful Accent 6" w:uiPriority="52"/>
-    <w:lsdException w:name="Mention" w:semiHidden="1" w:unhideWhenUsed="1"/>
-    <w:lsdException w:name="Smart Hyperlink" w:semiHidden="1" w:unhideWhenUsed="1"/>
-    <w:lsdException w:name="Hashtag" w:semiHidden="1" w:unhideWhenUsed="1"/>
-    <w:lsdException w:name="Unresolved Mention" w:semiHidden="1" w:unhideWhenUsed="1"/>
-    <w:lsdException w:name="Smart Link" w:semiHidden="1" w:unhideWhenUsed="1"/>
   </w:latentStyles>
   <w:style w:type="paragraph" w:default="1" w:styleId="Normal">
     <w:name w:val="Normal"/>
@@ -8274,7 +9415,7 @@
       <w:szCs w:val="24"/>
     </w:rPr>
   </w:style>
-  <w:style w:type="table" w:styleId="Tablaconcuadrculaclara">
+  <w:style w:type="table" w:styleId="Cuadrculadetablaclara">
     <w:name w:val="Grid Table Light"/>
     <w:basedOn w:val="Tablanormal"/>
     <w:uiPriority w:val="40"/>
@@ -8296,7 +9437,7 @@
   <w:style w:type="table" w:customStyle="1" w:styleId="Cuadrculadetablaclara1">
     <w:name w:val="Cuadrícula de tabla clara1"/>
     <w:basedOn w:val="Tablanormal"/>
-    <w:next w:val="Tablaconcuadrculaclara"/>
+    <w:next w:val="Cuadrculadetablaclara"/>
     <w:uiPriority w:val="40"/>
     <w:rsid w:val="00943DF1"/>
     <w:pPr>
@@ -8799,7 +9940,7 @@
 </file>
 
 <file path=customXml/itemProps4.xml><?xml version="1.0" encoding="utf-8"?>
-<ds:datastoreItem xmlns:ds="http://schemas.openxmlformats.org/officeDocument/2006/customXml" ds:itemID="{FBD61725-A60E-40F3-AB5D-0E7F797DD77D}">
+<ds:datastoreItem xmlns:ds="http://schemas.openxmlformats.org/officeDocument/2006/customXml" ds:itemID="{E2D13650-A7DE-4116-AAEE-ED672E73685B}">
   <ds:schemaRefs>
     <ds:schemaRef ds:uri="http://schemas.openxmlformats.org/officeDocument/2006/bibliography"/>
   </ds:schemaRefs>

</xml_diff>